<commit_message>
Ground education/cue-taking discussion in literature, update abstract with findings
Integrate Consensus search results on education and partisan cue-taking
(Ehret, Sparks & Sherman 2017; Vrânceanu 2022; Houston & Barone 2026) into
the Cues and Cue-Taking theory section and the Discussion's treatment of the
null H3/H4 result and the education x political-beliefs interaction. Update
the abstract to report findings rather than only the design. Add the APSA
2026 conference presentation deck and PDF.

Co-Authored-By: Claude Sonnet 5 <noreply@anthropic.com>
Claude-Session: https://claude.ai/code/session_01EtLtgfDDLmouQLyqEft322
</commit_message>
<xml_diff>
--- a/_output/cue-actions.docx
+++ b/_output/cue-actions.docx
@@ -540,7 +540,31 @@
         <w:t xml:space="preserve">(Hamilton 2011)</w:t>
       </w:r>
       <w:r>
-        <w:t xml:space="preserve">. Together, this literature suggests that a college degree is likely to shape responsiveness to Trump and climate cues, but the direction of that relationship is less straightforward than the low-information heuristic model implies.</w:t>
+        <w:t xml:space="preserve">. This amplifying pattern is not limited to climate change specifically: Ehret, Sparks, and Sherman</w:t>
+      </w:r>
+      <w:r>
+        <w:t xml:space="preserve"> </w:t>
+      </w:r>
+      <w:r>
+        <w:t xml:space="preserve">(2017)</w:t>
+      </w:r>
+      <w:r>
+        <w:t xml:space="preserve"> </w:t>
+      </w:r>
+      <w:r>
+        <w:t xml:space="preserve">find that more educated liberals and conservatives diverge further from one another on environmental attitudes generally, consistent with an ideological-consistency model in which education strengthens attentiveness to elite cues rather than substituting for them. Yet education’s moderating role may itself be conditional on whether a cue is congruent with a respondent’s existing predispositions. Vrânceanu</w:t>
+      </w:r>
+      <w:r>
+        <w:t xml:space="preserve"> </w:t>
+      </w:r>
+      <w:r>
+        <w:t xml:space="preserve">(2022)</w:t>
+      </w:r>
+      <w:r>
+        <w:t xml:space="preserve"> </w:t>
+      </w:r>
+      <w:r>
+        <w:t xml:space="preserve">finds that less-educated partisans shift the most when exposed to a cue that conflicts with the values typically associated with their level of education, while highly educated partisans are comparatively insensitive to such incongruent cues. Together, this literature suggests that a college degree is likely to shape responsiveness to Trump and climate cues, but the direction of that relationship is less straightforward than the low-information heuristic model implies.</w:t>
       </w:r>
     </w:p>
     <w:p>
@@ -904,7 +928,7 @@
         <w:t xml:space="preserve"> </w:t>
       </w:r>
       <w:r>
-        <w:t xml:space="preserve">(US Department of Interior" 2025)</w:t>
+        <w:t xml:space="preserve">(US Department of Interior 2025)</w:t>
       </w:r>
       <w:r>
         <w:t xml:space="preserve">, and separately halted construction on offshore wind projects along the East Coast, two of which were nearly complete</w:t>
@@ -977,37 +1001,7 @@
         <w:t xml:space="preserve"> </w:t>
       </w:r>
       <w:r>
-        <w:t xml:space="preserve">(</w:t>
-      </w:r>
-      <w:r>
-        <w:t xml:space="preserve">“Trump’s</w:t>
-      </w:r>
-      <w:r>
-        <w:t xml:space="preserve"> </w:t>
-      </w:r>
-      <w:r>
-        <w:t xml:space="preserve">Licensing Goals Pile Pressure</w:t>
-      </w:r>
-      <w:r>
-        <w:t xml:space="preserve"> </w:t>
-      </w:r>
-      <w:r>
-        <w:t xml:space="preserve">on</w:t>
-      </w:r>
-      <w:r>
-        <w:t xml:space="preserve"> </w:t>
-      </w:r>
-      <w:r>
-        <w:t xml:space="preserve">Nuclear Regulator</w:t>
-      </w:r>
-      <w:r>
-        <w:t xml:space="preserve">”</w:t>
-      </w:r>
-      <w:r>
-        <w:t xml:space="preserve"> </w:t>
-      </w:r>
-      <w:r>
-        <w:t xml:space="preserve">2025; US Department of Energy" 2025)</w:t>
+        <w:t xml:space="preserve">(Reuters 2025; US Department of Energy 2025)</w:t>
       </w:r>
       <w:r>
         <w:t xml:space="preserve">.</w:t>
@@ -5311,6 +5305,24 @@
         <w:t xml:space="preserve">(Bakker, Lelkes, and Malka 2019)</w:t>
       </w:r>
       <w:r>
+        <w:t xml:space="preserve">. It may also reflect the congruent nature of the Trump cue for conservative Republicans specifically. Prior work on cross-pressured cue-taking finds that education most clearly moderates responses to cues that conflict with a respondent’s predispositions, with little role for education when a cue instead reinforces an existing partisan alignment</w:t>
+      </w:r>
+      <w:r>
+        <w:t xml:space="preserve"> </w:t>
+      </w:r>
+      <w:r>
+        <w:t xml:space="preserve">(Vrânceanu 2022)</w:t>
+      </w:r>
+      <w:r>
+        <w:t xml:space="preserve">. More broadly, this pattern is consistent with survey-experimental evidence that cues from high-profile partisan officials chiefly widen partisan polarization rather than persuade respondents to cross into out-group territory, regardless of respondents’ education</w:t>
+      </w:r>
+      <w:r>
+        <w:t xml:space="preserve"> </w:t>
+      </w:r>
+      <w:r>
+        <w:t xml:space="preserve">(Houston and Barone 2026)</w:t>
+      </w:r>
+      <w:r>
         <w:t xml:space="preserve">.</w:t>
       </w:r>
     </w:p>
@@ -5320,6 +5332,26 @@
       </w:pPr>
       <w:r>
         <w:t xml:space="preserve">Although education did not moderate either cue’s effect, it did independently condition support among the most ideologically committed respondents, in a two-way interaction with political beliefs. Conservative Republicans and liberal Democrats with a college degree were both less supportive than their non-college co-partisans of cancelling the nearly complete offshore wind project and of shortening the nuclear licensing timeline, and college-educated liberal Democrats were also less supportive of eliminating the wind and solar tax credits. This pattern runs opposite to the effect of a college degree among moderate and other respondents, for whom education is associated with greater, not lower, support for these same actions. This suggests that a college degree does not shift support for Trump’s energy actions uniformly but instead interacts with political beliefs, dampening support among committed partisans on both sides while raising it among those without a strong partisan or ideological attachment.</w:t>
+      </w:r>
+    </w:p>
+    <w:p>
+      <w:pPr>
+        <w:pStyle w:val="BodyText"/>
+      </w:pPr>
+      <w:r>
+        <w:t xml:space="preserve">For liberal Democrats, this pattern fits Ehret, Sparks, and Sherman’s</w:t>
+      </w:r>
+      <w:r>
+        <w:t xml:space="preserve"> </w:t>
+      </w:r>
+      <w:r>
+        <w:t xml:space="preserve">(2017)</w:t>
+      </w:r>
+      <w:r>
+        <w:t xml:space="preserve"> </w:t>
+      </w:r>
+      <w:r>
+        <w:t xml:space="preserve">ideological-consistency model, in which more educated liberals hold more strongly pro-environmental positions than their less educated co-partisans. The pattern among conservative Republicans, however, runs opposite to what that model would predict, as more educated Republicans were less, not more, supportive of actions that curtail wind energy and nuclear expansion specifically. This suggests that education’s role in amplifying partisan-consistent positions on energy may not be symmetric across parties, an asymmetry consistent with this study’s broader finding that the climate and Trump cues themselves affected Republicans and Democrats differently.</w:t>
       </w:r>
     </w:p>
     <w:p>
@@ -8310,7 +8342,7 @@
       </w:r>
     </w:p>
     <w:bookmarkEnd w:id="32"/>
-    <w:bookmarkStart w:id="83" w:name="references"/>
+    <w:bookmarkStart w:id="86" w:name="references"/>
     <w:p>
       <w:pPr>
         <w:pStyle w:val="Heading1"/>
@@ -8319,7 +8351,7 @@
         <w:t xml:space="preserve">References</w:t>
       </w:r>
     </w:p>
-    <w:bookmarkStart w:id="82" w:name="refs"/>
+    <w:bookmarkStart w:id="85" w:name="refs"/>
     <w:bookmarkStart w:id="33" w:name="ref-abramowitzUnitedStatesRacial2019"/>
     <w:p>
       <w:pPr>
@@ -9185,7 +9217,81 @@
       </w:r>
     </w:p>
     <w:bookmarkEnd w:id="42"/>
-    <w:bookmarkStart w:id="43" w:name="ref-essigTrumpEffectPolitical2021"/>
+    <w:bookmarkStart w:id="43" w:name="Xa23a641e1ade11206a381a23263cca1d943fc5d"/>
+    <w:p>
+      <w:pPr>
+        <w:pStyle w:val="Bibliography"/>
+      </w:pPr>
+      <w:r>
+        <w:t xml:space="preserve">Ehret, Phillip J., Aaron C. Sparks, and David K. Sherman. 2017.</w:t>
+      </w:r>
+      <w:r>
+        <w:t xml:space="preserve"> </w:t>
+      </w:r>
+      <w:r>
+        <w:t xml:space="preserve">“Support for</w:t>
+      </w:r>
+      <w:r>
+        <w:t xml:space="preserve"> </w:t>
+      </w:r>
+      <w:r>
+        <w:t xml:space="preserve">Environmental Protection</w:t>
+      </w:r>
+      <w:r>
+        <w:t xml:space="preserve">:</w:t>
+      </w:r>
+      <w:r>
+        <w:t xml:space="preserve"> </w:t>
+      </w:r>
+      <w:r>
+        <w:t xml:space="preserve">An Integration</w:t>
+      </w:r>
+      <w:r>
+        <w:t xml:space="preserve"> </w:t>
+      </w:r>
+      <w:r>
+        <w:t xml:space="preserve">of</w:t>
+      </w:r>
+      <w:r>
+        <w:t xml:space="preserve"> </w:t>
+      </w:r>
+      <w:r>
+        <w:t xml:space="preserve">Ideological-Consistency</w:t>
+      </w:r>
+      <w:r>
+        <w:t xml:space="preserve"> </w:t>
+      </w:r>
+      <w:r>
+        <w:t xml:space="preserve">and</w:t>
+      </w:r>
+      <w:r>
+        <w:t xml:space="preserve"> </w:t>
+      </w:r>
+      <w:r>
+        <w:t xml:space="preserve">Information-Deficit Models</w:t>
+      </w:r>
+      <w:r>
+        <w:t xml:space="preserve">.”</w:t>
+      </w:r>
+      <w:r>
+        <w:t xml:space="preserve"> </w:t>
+      </w:r>
+      <w:r>
+        <w:rPr>
+          <w:i/>
+          <w:iCs/>
+        </w:rPr>
+        <w:t xml:space="preserve">Environmental Politics</w:t>
+      </w:r>
+      <w:r>
+        <w:t xml:space="preserve"> </w:t>
+      </w:r>
+      <w:r>
+        <w:t xml:space="preserve">26(2): 253–77.</w:t>
+      </w:r>
+    </w:p>
+    <w:bookmarkEnd w:id="43"/>
+    <w:bookmarkStart w:id="44" w:name="ref-essigTrumpEffectPolitical2021"/>
     <w:p>
       <w:pPr>
         <w:pStyle w:val="Bibliography"/>
@@ -9282,8 +9388,8 @@
         <w:t xml:space="preserve">49(3): 328–42.</w:t>
       </w:r>
     </w:p>
-    <w:bookmarkEnd w:id="43"/>
-    <w:bookmarkStart w:id="44" w:name="ref-feldmanClimateChangePolarizing2018"/>
+    <w:bookmarkEnd w:id="44"/>
+    <w:bookmarkStart w:id="45" w:name="ref-feldmanClimateChangePolarizing2018"/>
     <w:p>
       <w:pPr>
         <w:pStyle w:val="Bibliography"/>
@@ -9368,8 +9474,8 @@
         <w:t xml:space="preserve">51: 54–66.</w:t>
       </w:r>
     </w:p>
-    <w:bookmarkEnd w:id="44"/>
-    <w:bookmarkStart w:id="45" w:name="ref-gerrardTrumpsMultiProngedAttack2025"/>
+    <w:bookmarkEnd w:id="45"/>
+    <w:bookmarkStart w:id="46" w:name="ref-gerrardTrumpsMultiProngedAttack2025"/>
     <w:p>
       <w:pPr>
         <w:pStyle w:val="Bibliography"/>
@@ -9418,8 +9524,8 @@
         <w:t xml:space="preserve">.</w:t>
       </w:r>
     </w:p>
-    <w:bookmarkEnd w:id="45"/>
-    <w:bookmarkStart w:id="46" w:name="ref-grossmannPolarizedDegreesHow2024"/>
+    <w:bookmarkEnd w:id="46"/>
+    <w:bookmarkStart w:id="47" w:name="ref-grossmannPolarizedDegreesHow2024"/>
     <w:p>
       <w:pPr>
         <w:pStyle w:val="Bibliography"/>
@@ -9532,8 +9638,8 @@
         <w:t xml:space="preserve">. Cambridge: Cambridge University Press. https://www.cambridge.org/core/books/polarized-by-degrees/73B3136DC05749099EB07787A48FE522 (February 26, 2026).</w:t>
       </w:r>
     </w:p>
-    <w:bookmarkEnd w:id="46"/>
-    <w:bookmarkStart w:id="47" w:name="X3dc7f787e182e4dd48e8853dfbac57823334453"/>
+    <w:bookmarkEnd w:id="47"/>
+    <w:bookmarkStart w:id="48" w:name="X3dc7f787e182e4dd48e8853dfbac57823334453"/>
     <w:p>
       <w:pPr>
         <w:pStyle w:val="Bibliography"/>
@@ -9585,8 +9691,8 @@
         <w:t xml:space="preserve">141: 111448.</w:t>
       </w:r>
     </w:p>
-    <w:bookmarkEnd w:id="47"/>
-    <w:bookmarkStart w:id="48" w:name="X5880f069ffcfa3094c79115709cc9df3292fa0f"/>
+    <w:bookmarkEnd w:id="48"/>
+    <w:bookmarkStart w:id="49" w:name="X5880f069ffcfa3094c79115709cc9df3292fa0f"/>
     <w:p>
       <w:pPr>
         <w:pStyle w:val="Bibliography"/>
@@ -9662,8 +9768,8 @@
         <w:t xml:space="preserve">104(2): 231–42.</w:t>
       </w:r>
     </w:p>
-    <w:bookmarkEnd w:id="48"/>
-    <w:bookmarkStart w:id="49" w:name="ref-hamiltonChangeWindUS2018"/>
+    <w:bookmarkEnd w:id="49"/>
+    <w:bookmarkStart w:id="50" w:name="ref-hamiltonChangeWindUS2018"/>
     <w:p>
       <w:pPr>
         <w:pStyle w:val="Bibliography"/>
@@ -9748,8 +9854,8 @@
         <w:t xml:space="preserve">8(1): 11.</w:t>
       </w:r>
     </w:p>
-    <w:bookmarkEnd w:id="49"/>
-    <w:bookmarkStart w:id="50" w:name="ref-hartPoliticalPolarizationSupport2021"/>
+    <w:bookmarkEnd w:id="50"/>
+    <w:bookmarkStart w:id="51" w:name="ref-hartPoliticalPolarizationSupport2021"/>
     <w:p>
       <w:pPr>
         <w:pStyle w:val="Bibliography"/>
@@ -9813,8 +9919,8 @@
         <w:t xml:space="preserve">150: 112156.</w:t>
       </w:r>
     </w:p>
-    <w:bookmarkEnd w:id="50"/>
-    <w:bookmarkStart w:id="51" w:name="ref-hawesClimateSciencePolitics2022"/>
+    <w:bookmarkEnd w:id="51"/>
+    <w:bookmarkStart w:id="52" w:name="ref-hawesClimateSciencePolitics2022"/>
     <w:p>
       <w:pPr>
         <w:pStyle w:val="Bibliography"/>
@@ -9935,8 +10041,79 @@
         <w:t xml:space="preserve">85: 102419.</w:t>
       </w:r>
     </w:p>
-    <w:bookmarkEnd w:id="51"/>
-    <w:bookmarkStart w:id="52" w:name="ref-howellSeeingRiskColoredGlasses2019"/>
+    <w:bookmarkEnd w:id="52"/>
+    <w:bookmarkStart w:id="53" w:name="ref-houstonEngagementHighProfile2026"/>
+    <w:p>
+      <w:pPr>
+        <w:pStyle w:val="Bibliography"/>
+      </w:pPr>
+      <w:r>
+        <w:t xml:space="preserve">Houston, David M., and Alyssa Barone. 2026.</w:t>
+      </w:r>
+      <w:r>
+        <w:t xml:space="preserve"> </w:t>
+      </w:r>
+      <w:r>
+        <w:t xml:space="preserve">“How the</w:t>
+      </w:r>
+      <w:r>
+        <w:t xml:space="preserve"> </w:t>
+      </w:r>
+      <w:r>
+        <w:t xml:space="preserve">Engagement</w:t>
+      </w:r>
+      <w:r>
+        <w:t xml:space="preserve"> </w:t>
+      </w:r>
+      <w:r>
+        <w:t xml:space="preserve">of</w:t>
+      </w:r>
+      <w:r>
+        <w:t xml:space="preserve"> </w:t>
+      </w:r>
+      <w:r>
+        <w:t xml:space="preserve">High-Profile Partisan Officials Affects Education Politics</w:t>
+      </w:r>
+      <w:r>
+        <w:t xml:space="preserve">,</w:t>
+      </w:r>
+      <w:r>
+        <w:t xml:space="preserve"> </w:t>
+      </w:r>
+      <w:r>
+        <w:t xml:space="preserve">Public Opinion</w:t>
+      </w:r>
+      <w:r>
+        <w:t xml:space="preserve">, and</w:t>
+      </w:r>
+      <w:r>
+        <w:t xml:space="preserve"> </w:t>
+      </w:r>
+      <w:r>
+        <w:t xml:space="preserve">Polarization</w:t>
+      </w:r>
+      <w:r>
+        <w:t xml:space="preserve">.”</w:t>
+      </w:r>
+      <w:r>
+        <w:t xml:space="preserve"> </w:t>
+      </w:r>
+      <w:r>
+        <w:rPr>
+          <w:i/>
+          <w:iCs/>
+        </w:rPr>
+        <w:t xml:space="preserve">Education Finance and Policy</w:t>
+      </w:r>
+      <w:r>
+        <w:t xml:space="preserve"> </w:t>
+      </w:r>
+      <w:r>
+        <w:t xml:space="preserve">21(1): 97–120.</w:t>
+      </w:r>
+    </w:p>
+    <w:bookmarkEnd w:id="53"/>
+    <w:bookmarkStart w:id="54" w:name="ref-howellSeeingRiskColoredGlasses2019"/>
     <w:p>
       <w:pPr>
         <w:pStyle w:val="Bibliography"/>
@@ -10039,8 +10216,8 @@
         <w:t xml:space="preserve">55: 168–78.</w:t>
       </w:r>
     </w:p>
-    <w:bookmarkEnd w:id="52"/>
-    <w:bookmarkStart w:id="53" w:name="ref-joselowHowTrumpsFirst2025"/>
+    <w:bookmarkEnd w:id="54"/>
+    <w:bookmarkStart w:id="55" w:name="ref-joselowHowTrumpsFirst2025"/>
     <w:p>
       <w:pPr>
         <w:pStyle w:val="Bibliography"/>
@@ -10113,8 +10290,8 @@
         <w:t xml:space="preserve">. https://www.nytimes.com/2025/12/22/climate/how-trumps-first-year-reshaped-us-energy-and-climate-policy.html (December 22, 2025).</w:t>
       </w:r>
     </w:p>
-    <w:bookmarkEnd w:id="53"/>
-    <w:bookmarkStart w:id="54" w:name="ref-kahanIdeologyMotivatedReasoning2013"/>
+    <w:bookmarkEnd w:id="55"/>
+    <w:bookmarkStart w:id="56" w:name="ref-kahanIdeologyMotivatedReasoning2013"/>
     <w:p>
       <w:pPr>
         <w:pStyle w:val="Bibliography"/>
@@ -10163,8 +10340,8 @@
         <w:t xml:space="preserve">8(4): 407–24.</w:t>
       </w:r>
     </w:p>
-    <w:bookmarkEnd w:id="54"/>
-    <w:bookmarkStart w:id="55" w:name="ref-kamWhoToesParty2005"/>
+    <w:bookmarkEnd w:id="56"/>
+    <w:bookmarkStart w:id="57" w:name="ref-kamWhoToesParty2005"/>
     <w:p>
       <w:pPr>
         <w:pStyle w:val="Bibliography"/>
@@ -10243,8 +10420,8 @@
         <w:t xml:space="preserve">27(2): 163–82.</w:t>
       </w:r>
     </w:p>
-    <w:bookmarkEnd w:id="55"/>
-    <w:bookmarkStart w:id="56" w:name="X4a74c286bbc8d332dc68d7a28b845a590f64f65"/>
+    <w:bookmarkEnd w:id="57"/>
+    <w:bookmarkStart w:id="58" w:name="X4a74c286bbc8d332dc68d7a28b845a590f64f65"/>
     <w:p>
       <w:pPr>
         <w:pStyle w:val="Bibliography"/>
@@ -10329,8 +10506,8 @@
         <w:t xml:space="preserve">47(3): 425–79.</w:t>
       </w:r>
     </w:p>
-    <w:bookmarkEnd w:id="56"/>
-    <w:bookmarkStart w:id="57" w:name="ref-leeperPoliticalPartiesMotivated2014"/>
+    <w:bookmarkEnd w:id="58"/>
+    <w:bookmarkStart w:id="59" w:name="ref-leeperPoliticalPartiesMotivated2014"/>
     <w:p>
       <w:pPr>
         <w:pStyle w:val="Bibliography"/>
@@ -10388,8 +10565,8 @@
         <w:t xml:space="preserve">35(S1): 129–56.</w:t>
       </w:r>
     </w:p>
-    <w:bookmarkEnd w:id="57"/>
-    <w:bookmarkStart w:id="58" w:name="ref-mayerPartisanshipPoliticsEnergy2019"/>
+    <w:bookmarkEnd w:id="59"/>
+    <w:bookmarkStart w:id="60" w:name="ref-mayerPartisanshipPoliticsEnergy2019"/>
     <w:p>
       <w:pPr>
         <w:pStyle w:val="Bibliography"/>
@@ -10471,8 +10648,8 @@
         <w:t xml:space="preserve">53: 85–88.</w:t>
       </w:r>
     </w:p>
-    <w:bookmarkEnd w:id="58"/>
-    <w:bookmarkStart w:id="59" w:name="ref-mcbethPoliticalIdeologyNuclear2023a"/>
+    <w:bookmarkEnd w:id="60"/>
+    <w:bookmarkStart w:id="61" w:name="ref-mcbethPoliticalIdeologyNuclear2023a"/>
     <w:p>
       <w:pPr>
         <w:pStyle w:val="Bibliography"/>
@@ -10551,8 +10728,8 @@
         <w:t xml:space="preserve">40(1): 88–118.</w:t>
       </w:r>
     </w:p>
-    <w:bookmarkEnd w:id="59"/>
-    <w:bookmarkStart w:id="60" w:name="ref-mcconnellGreenNewDeal2022"/>
+    <w:bookmarkEnd w:id="61"/>
+    <w:bookmarkStart w:id="62" w:name="ref-mcconnellGreenNewDeal2022"/>
     <w:p>
       <w:pPr>
         <w:pStyle w:val="Bibliography"/>
@@ -10646,8 +10823,8 @@
         <w:t xml:space="preserve">0(0): 1–33.</w:t>
       </w:r>
     </w:p>
-    <w:bookmarkEnd w:id="60"/>
-    <w:bookmarkStart w:id="61" w:name="ref-merkleyPartyCuesNews2021"/>
+    <w:bookmarkEnd w:id="62"/>
+    <w:bookmarkStart w:id="63" w:name="ref-merkleyPartyCuesNews2021"/>
     <w:p>
       <w:pPr>
         <w:pStyle w:val="Bibliography"/>
@@ -10738,8 +10915,8 @@
         <w:t xml:space="preserve">51(4): 1439–56.</w:t>
       </w:r>
     </w:p>
-    <w:bookmarkEnd w:id="61"/>
-    <w:bookmarkStart w:id="62" w:name="ref-merolaNumeracyPersuasiveEffect2016"/>
+    <w:bookmarkEnd w:id="63"/>
+    <w:bookmarkStart w:id="64" w:name="ref-merolaNumeracyPersuasiveEffect2016"/>
     <w:p>
       <w:pPr>
         <w:pStyle w:val="Bibliography"/>
@@ -10803,8 +10980,8 @@
         <w:t xml:space="preserve">80(2): 554–62.</w:t>
       </w:r>
     </w:p>
-    <w:bookmarkEnd w:id="62"/>
-    <w:bookmarkStart w:id="63" w:name="ref-morganTrumpVotersWhite2018"/>
+    <w:bookmarkEnd w:id="64"/>
+    <w:bookmarkStart w:id="65" w:name="ref-morganTrumpVotersWhite2018"/>
     <w:p>
       <w:pPr>
         <w:pStyle w:val="Bibliography"/>
@@ -10856,8 +11033,8 @@
         <w:t xml:space="preserve">5: 234–45.</w:t>
       </w:r>
     </w:p>
-    <w:bookmarkEnd w:id="63"/>
-    <w:bookmarkStart w:id="64" w:name="ref-nicholsonPolarizingCues2012"/>
+    <w:bookmarkEnd w:id="65"/>
+    <w:bookmarkStart w:id="66" w:name="ref-nicholsonPolarizingCues2012"/>
     <w:p>
       <w:pPr>
         <w:pStyle w:val="Bibliography"/>
@@ -10897,8 +11074,8 @@
         <w:t xml:space="preserve">56(1): 52–66.</w:t>
       </w:r>
     </w:p>
-    <w:bookmarkEnd w:id="64"/>
-    <w:bookmarkStart w:id="65" w:name="X4a9f7001be710c75f5ae04dcf83331b9ec98fa3"/>
+    <w:bookmarkEnd w:id="66"/>
+    <w:bookmarkStart w:id="67" w:name="X4a9f7001be710c75f5ae04dcf83331b9ec98fa3"/>
     <w:p>
       <w:pPr>
         <w:pStyle w:val="Bibliography"/>
@@ -10995,8 +11172,8 @@
         <w:t xml:space="preserve">35(4): 831–54.</w:t>
       </w:r>
     </w:p>
-    <w:bookmarkEnd w:id="65"/>
-    <w:bookmarkStart w:id="66" w:name="X0aeaf6b854948b2cdf0296f02791eebffa60678"/>
+    <w:bookmarkEnd w:id="67"/>
+    <w:bookmarkStart w:id="68" w:name="X0aeaf6b854948b2cdf0296f02791eebffa60678"/>
     <w:p>
       <w:pPr>
         <w:pStyle w:val="Bibliography"/>
@@ -11060,8 +11237,51 @@
         <w:t xml:space="preserve">64: 101441.</w:t>
       </w:r>
     </w:p>
-    <w:bookmarkEnd w:id="66"/>
-    <w:bookmarkStart w:id="67" w:name="ref-sancesHowUnusualWas2019"/>
+    <w:bookmarkEnd w:id="68"/>
+    <w:bookmarkStart w:id="69" w:name="ref-TrumpsLicensingGoals2025"/>
+    <w:p>
+      <w:pPr>
+        <w:pStyle w:val="Bibliography"/>
+      </w:pPr>
+      <w:r>
+        <w:t xml:space="preserve">Reuters. 2025.</w:t>
+      </w:r>
+      <w:r>
+        <w:t xml:space="preserve"> </w:t>
+      </w:r>
+      <w:r>
+        <w:t xml:space="preserve">“Trump’s</w:t>
+      </w:r>
+      <w:r>
+        <w:t xml:space="preserve"> </w:t>
+      </w:r>
+      <w:r>
+        <w:t xml:space="preserve">Licensing Goals Pile Pressure</w:t>
+      </w:r>
+      <w:r>
+        <w:t xml:space="preserve"> </w:t>
+      </w:r>
+      <w:r>
+        <w:t xml:space="preserve">on</w:t>
+      </w:r>
+      <w:r>
+        <w:t xml:space="preserve"> </w:t>
+      </w:r>
+      <w:r>
+        <w:t xml:space="preserve">Nuclear Regulator</w:t>
+      </w:r>
+      <w:r>
+        <w:t xml:space="preserve">.”</w:t>
+      </w:r>
+      <w:r>
+        <w:t xml:space="preserve"> </w:t>
+      </w:r>
+      <w:r>
+        <w:t xml:space="preserve">https://www.reutersevents.com/nuclear/trumps-licensing-goals-pile-pressure-nuclear-regulator (August 25, 2026).</w:t>
+      </w:r>
+    </w:p>
+    <w:bookmarkEnd w:id="69"/>
+    <w:bookmarkStart w:id="70" w:name="ref-sancesHowUnusualWas2019"/>
     <w:p>
       <w:pPr>
         <w:pStyle w:val="Bibliography"/>
@@ -11140,8 +11360,8 @@
         <w:t xml:space="preserve">17(3): 666–78.</w:t>
       </w:r>
     </w:p>
-    <w:bookmarkEnd w:id="67"/>
-    <w:bookmarkStart w:id="68" w:name="X0e69b1a1d2b21b023d603a68c4b2dc6338da526"/>
+    <w:bookmarkEnd w:id="70"/>
+    <w:bookmarkStart w:id="71" w:name="X0e69b1a1d2b21b023d603a68c4b2dc6338da526"/>
     <w:p>
       <w:pPr>
         <w:pStyle w:val="Bibliography"/>
@@ -11193,8 +11413,8 @@
         <w:t xml:space="preserve">66(4): 559–81.</w:t>
       </w:r>
     </w:p>
-    <w:bookmarkEnd w:id="68"/>
-    <w:bookmarkStart w:id="69" w:name="X648763b5d97adc1fcb6fb627920ad47104e2864"/>
+    <w:bookmarkEnd w:id="71"/>
+    <w:bookmarkStart w:id="72" w:name="X648763b5d97adc1fcb6fb627920ad47104e2864"/>
     <w:p>
       <w:pPr>
         <w:pStyle w:val="Bibliography"/>
@@ -11252,8 +11472,8 @@
         <w:t xml:space="preserve">72(3): 630–45.</w:t>
       </w:r>
     </w:p>
-    <w:bookmarkEnd w:id="69"/>
-    <w:bookmarkStart w:id="70" w:name="ref-springTrumpAdministrationLimits2025"/>
+    <w:bookmarkEnd w:id="72"/>
+    <w:bookmarkStart w:id="73" w:name="ref-springTrumpAdministrationLimits2025"/>
     <w:p>
       <w:pPr>
         <w:pStyle w:val="Bibliography"/>
@@ -11311,8 +11531,8 @@
         <w:t xml:space="preserve">. https://www.washingtonpost.com/climate-environment/2025/08/15/tax-credits-renewable-energy-projects/ (August 25, 2026).</w:t>
       </w:r>
     </w:p>
-    <w:bookmarkEnd w:id="70"/>
-    <w:bookmarkStart w:id="71" w:name="X82af70148db7e113d5a09e59738f2b7ca652ba8"/>
+    <w:bookmarkEnd w:id="73"/>
+    <w:bookmarkStart w:id="74" w:name="X82af70148db7e113d5a09e59738f2b7ca652ba8"/>
     <w:p>
       <w:pPr>
         <w:pStyle w:val="Bibliography"/>
@@ -11376,8 +11596,8 @@
         <w:t xml:space="preserve">50(3): 755–69.</w:t>
       </w:r>
     </w:p>
-    <w:bookmarkEnd w:id="71"/>
-    <w:bookmarkStart w:id="72" w:name="ref-tappinEstimatingCausalEffects2026"/>
+    <w:bookmarkEnd w:id="74"/>
+    <w:bookmarkStart w:id="75" w:name="ref-tappinEstimatingCausalEffects2026"/>
     <w:p>
       <w:pPr>
         <w:pStyle w:val="Bibliography"/>
@@ -11453,8 +11673,8 @@
         <w:t xml:space="preserve">47(2).</w:t>
       </w:r>
     </w:p>
-    <w:bookmarkEnd w:id="72"/>
-    <w:bookmarkStart w:id="73" w:name="ref-taylorTrumpEffectImmigration2026"/>
+    <w:bookmarkEnd w:id="75"/>
+    <w:bookmarkStart w:id="76" w:name="ref-taylorTrumpEffectImmigration2026"/>
     <w:p>
       <w:pPr>
         <w:pStyle w:val="Bibliography"/>
@@ -11515,8 +11735,8 @@
         <w:t xml:space="preserve">46(1): 102–25.</w:t>
       </w:r>
     </w:p>
-    <w:bookmarkEnd w:id="73"/>
-    <w:bookmarkStart w:id="74" w:name="ref-thakoreTrumpAdministrationOrders2025"/>
+    <w:bookmarkEnd w:id="76"/>
+    <w:bookmarkStart w:id="77" w:name="ref-thakoreTrumpAdministrationOrders2025"/>
     <w:p>
       <w:pPr>
         <w:pStyle w:val="Bibliography"/>
@@ -11567,8 +11787,8 @@
         <w:t xml:space="preserve">https://www.cpr.org/2025/12/31/trump-order-craig-power-plant-open/ (August 25, 2026).</w:t>
       </w:r>
     </w:p>
-    <w:bookmarkEnd w:id="74"/>
-    <w:bookmarkStart w:id="75" w:name="ref-houseDeclaringNationalEnergy2025"/>
+    <w:bookmarkEnd w:id="77"/>
+    <w:bookmarkStart w:id="78" w:name="ref-houseDeclaringNationalEnergy2025"/>
     <w:p>
       <w:pPr>
         <w:pStyle w:val="Bibliography"/>
@@ -11598,8 +11818,8 @@
         <w:t xml:space="preserve">https://www.whitehouse.gov/presidential-actions/2025/01/declaring-a-national-energy-emergency/ (August 27, 2026).</w:t>
       </w:r>
     </w:p>
-    <w:bookmarkEnd w:id="75"/>
-    <w:bookmarkStart w:id="76" w:name="ref-wasserTrumpAdministrationPauses2025"/>
+    <w:bookmarkEnd w:id="78"/>
+    <w:bookmarkStart w:id="79" w:name="ref-wasserTrumpAdministrationPauses2025"/>
     <w:p>
       <w:pPr>
         <w:pStyle w:val="Bibliography"/>
@@ -11657,20 +11877,47 @@
         <w:t xml:space="preserve">. 2025. Morning Edition NPR. https://www.npr.org/2025/12/23/nx-s1-5652025/trump-administration-pauses-offshore-wind-projects-along-the-east-coast (August 25, 2026).</w:t>
       </w:r>
     </w:p>
-    <w:bookmarkEnd w:id="76"/>
-    <w:bookmarkStart w:id="77" w:name="ref-TrumpsLicensingGoals2025"/>
+    <w:bookmarkEnd w:id="79"/>
+    <w:bookmarkStart w:id="80" w:name="Xb7b0f966bce630ece6fc236487a6c3d1bc82a30"/>
     <w:p>
       <w:pPr>
         <w:pStyle w:val="Bibliography"/>
       </w:pPr>
       <w:r>
-        <w:t xml:space="preserve">“Trump’s</w:t>
-      </w:r>
-      <w:r>
-        <w:t xml:space="preserve"> </w:t>
-      </w:r>
-      <w:r>
-        <w:t xml:space="preserve">Licensing Goals Pile Pressure</w:t>
+        <w:t xml:space="preserve">US Department of Energy. 2025.</w:t>
+      </w:r>
+      <w:r>
+        <w:t xml:space="preserve"> </w:t>
+      </w:r>
+      <w:r>
+        <w:t xml:space="preserve">“9</w:t>
+      </w:r>
+      <w:r>
+        <w:t xml:space="preserve"> </w:t>
+      </w:r>
+      <w:r>
+        <w:t xml:space="preserve">Key Takeaways</w:t>
+      </w:r>
+      <w:r>
+        <w:t xml:space="preserve"> </w:t>
+      </w:r>
+      <w:r>
+        <w:t xml:space="preserve">from</w:t>
+      </w:r>
+      <w:r>
+        <w:t xml:space="preserve"> </w:t>
+      </w:r>
+      <w:r>
+        <w:t xml:space="preserve">President Trump</w:t>
+      </w:r>
+      <w:r>
+        <w:t xml:space="preserve">’s</w:t>
+      </w:r>
+      <w:r>
+        <w:t xml:space="preserve"> </w:t>
+      </w:r>
+      <w:r>
+        <w:t xml:space="preserve">Executive Orders</w:t>
       </w:r>
       <w:r>
         <w:t xml:space="preserve"> </w:t>
@@ -11682,7 +11929,7 @@
         <w:t xml:space="preserve"> </w:t>
       </w:r>
       <w:r>
-        <w:t xml:space="preserve">Nuclear Regulator</w:t>
+        <w:t xml:space="preserve">Nuclear Energy</w:t>
       </w:r>
       <w:r>
         <w:t xml:space="preserve">.”</w:t>
@@ -11691,62 +11938,92 @@
         <w:t xml:space="preserve"> </w:t>
       </w:r>
       <w:r>
-        <w:t xml:space="preserve">2025. https://www.reutersevents.com/nuclear/trumps-licensing-goals-pile-pressure-nuclear-regulator (August 25, 2026).</w:t>
+        <w:t xml:space="preserve">https://www.energy.gov/ne/articles/9-key-takeaways-president-trumps-executive-orders-nuclear-energy (August 25, 2026).</w:t>
       </w:r>
     </w:p>
-    <w:bookmarkEnd w:id="77"/>
-    <w:bookmarkStart w:id="78" w:name="Xb7b0f966bce630ece6fc236487a6c3d1bc82a30"/>
+    <w:bookmarkEnd w:id="80"/>
+    <w:bookmarkStart w:id="81" w:name="ref-InteriorUnleashesAmerican2025"/>
     <w:p>
       <w:pPr>
         <w:pStyle w:val="Bibliography"/>
       </w:pPr>
       <w:r>
-        <w:t xml:space="preserve">US Department of Energy". 2025.</w:t>
-      </w:r>
-      <w:r>
-        <w:t xml:space="preserve"> </w:t>
-      </w:r>
-      <w:r>
-        <w:t xml:space="preserve">“9</w:t>
-      </w:r>
-      <w:r>
-        <w:t xml:space="preserve"> </w:t>
-      </w:r>
-      <w:r>
-        <w:t xml:space="preserve">Key Takeaways</w:t>
-      </w:r>
-      <w:r>
-        <w:t xml:space="preserve"> </w:t>
-      </w:r>
-      <w:r>
-        <w:t xml:space="preserve">from</w:t>
-      </w:r>
-      <w:r>
-        <w:t xml:space="preserve"> </w:t>
-      </w:r>
-      <w:r>
-        <w:t xml:space="preserve">President Trump</w:t>
-      </w:r>
-      <w:r>
-        <w:t xml:space="preserve">’s</w:t>
-      </w:r>
-      <w:r>
-        <w:t xml:space="preserve"> </w:t>
-      </w:r>
-      <w:r>
-        <w:t xml:space="preserve">Executive Orders</w:t>
-      </w:r>
-      <w:r>
-        <w:t xml:space="preserve"> </w:t>
-      </w:r>
-      <w:r>
-        <w:t xml:space="preserve">on</w:t>
-      </w:r>
-      <w:r>
-        <w:t xml:space="preserve"> </w:t>
-      </w:r>
-      <w:r>
-        <w:t xml:space="preserve">Nuclear Energy</w:t>
+        <w:t xml:space="preserve">US Department of Interior. 2025.</w:t>
+      </w:r>
+      <w:r>
+        <w:t xml:space="preserve"> </w:t>
+      </w:r>
+      <w:r>
+        <w:t xml:space="preserve">“Interior</w:t>
+      </w:r>
+      <w:r>
+        <w:t xml:space="preserve"> </w:t>
+      </w:r>
+      <w:r>
+        <w:t xml:space="preserve">Unleashes American Coal Power</w:t>
+      </w:r>
+      <w:r>
+        <w:t xml:space="preserve"> </w:t>
+      </w:r>
+      <w:r>
+        <w:t xml:space="preserve">in</w:t>
+      </w:r>
+      <w:r>
+        <w:t xml:space="preserve"> </w:t>
+      </w:r>
+      <w:r>
+        <w:t xml:space="preserve">Bold Move</w:t>
+      </w:r>
+      <w:r>
+        <w:t xml:space="preserve"> </w:t>
+      </w:r>
+      <w:r>
+        <w:t xml:space="preserve">to</w:t>
+      </w:r>
+      <w:r>
+        <w:t xml:space="preserve"> </w:t>
+      </w:r>
+      <w:r>
+        <w:t xml:space="preserve">Advance Trump Administration Priorities</w:t>
+      </w:r>
+      <w:r>
+        <w:t xml:space="preserve"> </w:t>
+      </w:r>
+      <w:r>
+        <w:t xml:space="preserve">|</w:t>
+      </w:r>
+      <w:r>
+        <w:t xml:space="preserve"> </w:t>
+      </w:r>
+      <w:r>
+        <w:t xml:space="preserve">U</w:t>
+      </w:r>
+      <w:r>
+        <w:t xml:space="preserve">.</w:t>
+      </w:r>
+      <w:r>
+        <w:t xml:space="preserve">S</w:t>
+      </w:r>
+      <w:r>
+        <w:t xml:space="preserve">.</w:t>
+      </w:r>
+      <w:r>
+        <w:t xml:space="preserve"> </w:t>
+      </w:r>
+      <w:r>
+        <w:t xml:space="preserve">Department</w:t>
+      </w:r>
+      <w:r>
+        <w:t xml:space="preserve"> </w:t>
+      </w:r>
+      <w:r>
+        <w:t xml:space="preserve">of the</w:t>
+      </w:r>
+      <w:r>
+        <w:t xml:space="preserve"> </w:t>
+      </w:r>
+      <w:r>
+        <w:t xml:space="preserve">Interior</w:t>
       </w:r>
       <w:r>
         <w:t xml:space="preserve">.”</w:t>
@@ -11755,92 +12032,41 @@
         <w:t xml:space="preserve"> </w:t>
       </w:r>
       <w:r>
-        <w:t xml:space="preserve">https://www.energy.gov/ne/articles/9-key-takeaways-president-trumps-executive-orders-nuclear-energy (August 25, 2026).</w:t>
+        <w:t xml:space="preserve">https://www.doi.gov/pressreleases/interior-unleashes-american-coal-power-bold-move-advance-trump-administration (August 25, 2026).</w:t>
       </w:r>
     </w:p>
-    <w:bookmarkEnd w:id="78"/>
-    <w:bookmarkStart w:id="79" w:name="ref-InteriorUnleashesAmerican2025"/>
+    <w:bookmarkEnd w:id="81"/>
+    <w:bookmarkStart w:id="82" w:name="ref-vranceanuCrossPressuresAffect2022"/>
     <w:p>
       <w:pPr>
         <w:pStyle w:val="Bibliography"/>
       </w:pPr>
       <w:r>
-        <w:t xml:space="preserve">US Department of Interior". 2025.</w:t>
-      </w:r>
-      <w:r>
-        <w:t xml:space="preserve"> </w:t>
-      </w:r>
-      <w:r>
-        <w:t xml:space="preserve">“Interior</w:t>
-      </w:r>
-      <w:r>
-        <w:t xml:space="preserve"> </w:t>
-      </w:r>
-      <w:r>
-        <w:t xml:space="preserve">Unleashes American Coal Power</w:t>
-      </w:r>
-      <w:r>
-        <w:t xml:space="preserve"> </w:t>
-      </w:r>
-      <w:r>
-        <w:t xml:space="preserve">in</w:t>
-      </w:r>
-      <w:r>
-        <w:t xml:space="preserve"> </w:t>
-      </w:r>
-      <w:r>
-        <w:t xml:space="preserve">Bold Move</w:t>
-      </w:r>
-      <w:r>
-        <w:t xml:space="preserve"> </w:t>
-      </w:r>
-      <w:r>
-        <w:t xml:space="preserve">to</w:t>
-      </w:r>
-      <w:r>
-        <w:t xml:space="preserve"> </w:t>
-      </w:r>
-      <w:r>
-        <w:t xml:space="preserve">Advance Trump Administration Priorities</w:t>
-      </w:r>
-      <w:r>
-        <w:t xml:space="preserve"> </w:t>
-      </w:r>
-      <w:r>
-        <w:t xml:space="preserve">|</w:t>
-      </w:r>
-      <w:r>
-        <w:t xml:space="preserve"> </w:t>
-      </w:r>
-      <w:r>
-        <w:t xml:space="preserve">U</w:t>
-      </w:r>
-      <w:r>
-        <w:t xml:space="preserve">.</w:t>
-      </w:r>
-      <w:r>
-        <w:t xml:space="preserve">S</w:t>
-      </w:r>
-      <w:r>
-        <w:t xml:space="preserve">.</w:t>
-      </w:r>
-      <w:r>
-        <w:t xml:space="preserve"> </w:t>
-      </w:r>
-      <w:r>
-        <w:t xml:space="preserve">Department</w:t>
-      </w:r>
-      <w:r>
-        <w:t xml:space="preserve"> </w:t>
-      </w:r>
-      <w:r>
-        <w:t xml:space="preserve">of the</w:t>
-      </w:r>
-      <w:r>
-        <w:t xml:space="preserve"> </w:t>
-      </w:r>
-      <w:r>
-        <w:t xml:space="preserve">Interior</w:t>
+        <w:t xml:space="preserve">Vrânceanu, Alina. 2022.</w:t>
+      </w:r>
+      <w:r>
+        <w:t xml:space="preserve"> </w:t>
+      </w:r>
+      <w:r>
+        <w:t xml:space="preserve">“How Do Cross-Pressures Affect Immigration Attitudes?</w:t>
+      </w:r>
+      <w:r>
+        <w:t xml:space="preserve"> </w:t>
+      </w:r>
+      <w:r>
+        <w:t xml:space="preserve">Party</w:t>
+      </w:r>
+      <w:r>
+        <w:t xml:space="preserve"> </w:t>
+      </w:r>
+      <w:r>
+        <w:t xml:space="preserve">and</w:t>
+      </w:r>
+      <w:r>
+        <w:t xml:space="preserve"> </w:t>
+      </w:r>
+      <w:r>
+        <w:t xml:space="preserve">Educational Influences</w:t>
       </w:r>
       <w:r>
         <w:t xml:space="preserve">.”</w:t>
@@ -11849,11 +12075,21 @@
         <w:t xml:space="preserve"> </w:t>
       </w:r>
       <w:r>
-        <w:t xml:space="preserve">https://www.doi.gov/pressreleases/interior-unleashes-american-coal-power-bold-move-advance-trump-administration (August 25, 2026).</w:t>
+        <w:rPr>
+          <w:i/>
+          <w:iCs/>
+        </w:rPr>
+        <w:t xml:space="preserve">West European Politics</w:t>
+      </w:r>
+      <w:r>
+        <w:t xml:space="preserve"> </w:t>
+      </w:r>
+      <w:r>
+        <w:t xml:space="preserve">45(7): 1433–61.</w:t>
       </w:r>
     </w:p>
-    <w:bookmarkEnd w:id="79"/>
-    <w:bookmarkStart w:id="80" w:name="ref-yeoPartisanAmplificationRisk2014"/>
+    <w:bookmarkEnd w:id="82"/>
+    <w:bookmarkStart w:id="83" w:name="ref-yeoPartisanAmplificationRisk2014"/>
     <w:p>
       <w:pPr>
         <w:pStyle w:val="Bibliography"/>
@@ -11950,8 +12186,8 @@
         <w:t xml:space="preserve">67: 727–36.</w:t>
       </w:r>
     </w:p>
-    <w:bookmarkEnd w:id="80"/>
-    <w:bookmarkStart w:id="81" w:name="ref-zingherTRENDSDiplomaDivide2022"/>
+    <w:bookmarkEnd w:id="83"/>
+    <w:bookmarkStart w:id="84" w:name="ref-zingherTRENDSDiplomaDivide2022"/>
     <w:p>
       <w:pPr>
         <w:pStyle w:val="Bibliography"/>
@@ -12030,9 +12266,9 @@
         <w:t xml:space="preserve">75(2): 263–77.</w:t>
       </w:r>
     </w:p>
-    <w:bookmarkEnd w:id="81"/>
-    <w:bookmarkEnd w:id="82"/>
-    <w:bookmarkEnd w:id="83"/>
+    <w:bookmarkEnd w:id="84"/>
+    <w:bookmarkEnd w:id="85"/>
+    <w:bookmarkEnd w:id="86"/>
     <w:sectPr>
       <w:footnotePr>
         <w:numRestart w:val="eachSect"/>

</xml_diff>

<commit_message>
Add supplemental materials, VIF footnote, controls-robustness caveat
Adds cue-actions-supplemental.qmd (unweighted/controls/balance robustness
checks plus the exploratory climate x education model, moved out of the
manuscript's Appendix) and scripts/supplemental-analysis.R, modeled on the
cue-energy project's supplemental doc. Adds a methods footnote documenting
a VIF check on the H1-H4 interaction terms, and a Discussion footnote
flagging that the Cancel Wind Trump x conRep result loses significance
under the demographic-controls robustness check. Corrects a stale LOG.md
note that claimed demographic controls were in the main model.

Co-Authored-By: Claude Sonnet 5 <noreply@anthropic.com>
</commit_message>
<xml_diff>
--- a/_output/cue-actions.docx
+++ b/_output/cue-actions.docx
@@ -1775,7 +1775,7 @@
       </w:r>
     </w:p>
     <w:bookmarkEnd w:id="16"/>
-    <w:bookmarkStart w:id="28" w:name="results"/>
+    <w:bookmarkStart w:id="29" w:name="results"/>
     <w:p>
       <w:pPr>
         <w:pStyle w:val="Heading1"/>
@@ -2370,6 +2370,12 @@
       <w:r>
         <w:t xml:space="preserve">shows the results of the OLS models for cue condition and political beliefs.</w:t>
       </w:r>
+      <w:r>
+        <w:rPr>
+          <w:rStyle w:val="FootnoteReference"/>
+        </w:rPr>
+        <w:footnoteReference w:id="18"/>
+      </w:r>
     </w:p>
     <w:tbl>
       <w:tblPr>
@@ -2384,7 +2390,7 @@
       <w:tr>
         <w:tc>
           <w:tcPr/>
-          <w:bookmarkStart w:id="18" w:name="tbl-results"/>
+          <w:bookmarkStart w:id="19" w:name="tbl-results"/>
           <w:p>
             <w:pPr>
               <w:jc w:val="center"/>
@@ -4833,7 +4839,7 @@
               </w:tc>
             </w:tr>
           </w:tbl>
-          <w:bookmarkEnd w:id="18"/>
+          <w:bookmarkEnd w:id="19"/>
           <w:p/>
         </w:tc>
       </w:tr>
@@ -4913,7 +4919,7 @@
       <w:tr>
         <w:tc>
           <w:tcPr/>
-          <w:bookmarkStart w:id="22" w:name="fig-identity"/>
+          <w:bookmarkStart w:id="23" w:name="fig-identity"/>
           <w:p>
             <w:pPr>
               <w:jc w:val="center"/>
@@ -4937,18 +4943,18 @@
                 <wp:inline>
                   <wp:extent cx="5334000" cy="1939636"/>
                   <wp:effectExtent b="0" l="0" r="0" t="0"/>
-                  <wp:docPr descr="" title="" id="20" name="Picture"/>
+                  <wp:docPr descr="" title="" id="21" name="Picture"/>
                   <a:graphic>
                     <a:graphicData uri="http://schemas.openxmlformats.org/drawingml/2006/picture">
                       <pic:pic>
                         <pic:nvPicPr>
-                          <pic:cNvPr descr="cue-actions_files/figure-docx/fig-identity-1.png" id="21" name="Picture"/>
+                          <pic:cNvPr descr="cue-actions_files/figure-docx/fig-identity-1.png" id="22" name="Picture"/>
                           <pic:cNvPicPr>
                             <a:picLocks noChangeArrowheads="1" noChangeAspect="1"/>
                           </pic:cNvPicPr>
                         </pic:nvPicPr>
                         <pic:blipFill>
-                          <a:blip r:embed="rId19"/>
+                          <a:blip r:embed="rId20"/>
                           <a:stretch>
                             <a:fillRect/>
                           </a:stretch>
@@ -4975,7 +4981,7 @@
               </w:drawing>
             </w:r>
           </w:p>
-          <w:bookmarkEnd w:id="22"/>
+          <w:bookmarkEnd w:id="23"/>
         </w:tc>
       </w:tr>
     </w:tbl>
@@ -5048,7 +5054,7 @@
       <w:tr>
         <w:tc>
           <w:tcPr/>
-          <w:bookmarkStart w:id="26" w:name="fig-college"/>
+          <w:bookmarkStart w:id="27" w:name="fig-college"/>
           <w:p>
             <w:pPr>
               <w:jc w:val="center"/>
@@ -5072,18 +5078,18 @@
                 <wp:inline>
                   <wp:extent cx="5334000" cy="2909454"/>
                   <wp:effectExtent b="0" l="0" r="0" t="0"/>
-                  <wp:docPr descr="" title="" id="24" name="Picture"/>
+                  <wp:docPr descr="" title="" id="25" name="Picture"/>
                   <a:graphic>
                     <a:graphicData uri="http://schemas.openxmlformats.org/drawingml/2006/picture">
                       <pic:pic>
                         <pic:nvPicPr>
-                          <pic:cNvPr descr="cue-actions_files/figure-docx/fig-college-1.png" id="25" name="Picture"/>
+                          <pic:cNvPr descr="cue-actions_files/figure-docx/fig-college-1.png" id="26" name="Picture"/>
                           <pic:cNvPicPr>
                             <a:picLocks noChangeArrowheads="1" noChangeAspect="1"/>
                           </pic:cNvPicPr>
                         </pic:nvPicPr>
                         <pic:blipFill>
-                          <a:blip r:embed="rId23"/>
+                          <a:blip r:embed="rId24"/>
                           <a:stretch>
                             <a:fillRect/>
                           </a:stretch>
@@ -5110,7 +5116,7 @@
               </w:drawing>
             </w:r>
           </w:p>
-          <w:bookmarkEnd w:id="26"/>
+          <w:bookmarkEnd w:id="27"/>
         </w:tc>
       </w:tr>
     </w:tbl>
@@ -5125,7 +5131,7 @@
         <w:rPr>
           <w:rStyle w:val="FootnoteReference"/>
         </w:rPr>
-        <w:footnoteReference w:id="27"/>
+        <w:footnoteReference w:id="28"/>
       </w:r>
     </w:p>
     <w:p>
@@ -5171,8 +5177,8 @@
         <w:t xml:space="preserve">Overall, the evidence supported the Trump cue aspect of H1, as the Trump cue increased support among conservative Republicans for four of the five actions, including coal leasing, keeping coal plants open, cancelling the offshore wind project, and nuclear licensing. However, there was no support for the other hypotheses, as neither cue impacted liberal Democrats’ support (H2), nor did education moderate the Trump cue’s effect on either group (H3, H4).</w:t>
       </w:r>
     </w:p>
-    <w:bookmarkEnd w:id="28"/>
-    <w:bookmarkStart w:id="29" w:name="discussion-and-conclusion"/>
+    <w:bookmarkEnd w:id="29"/>
+    <w:bookmarkStart w:id="31" w:name="discussion-and-conclusion"/>
     <w:p>
       <w:pPr>
         <w:pStyle w:val="Heading1"/>
@@ -5186,7 +5192,7 @@
         <w:pStyle w:val="FirstParagraph"/>
       </w:pPr>
       <w:r>
-        <w:t xml:space="preserve">In this paper, I examined whether a Trump cue or a climate change cue shapes public support for five of the second Trump administration’s actions on energy, and whether these effects vary by political beliefs and education. Overall, the clearest pattern in the results is that the Trump cue, but not the climate cue, increased support for Trump’s actions among conservative Republicans, while liberal Democrats and less-educated respondents were largely unresponsive to either cue.</w:t>
+        <w:t xml:space="preserve">Since his return to office, President Trump has sought to stymie the transition from fossil fuels to renewable sources of energy. By acting as a cue which activates ideological and partisan attachments, Trump’s actions threaten to further polarize the public regarding energy sources. In this paper, I examined whether a Trump cue or a climate change cue shapes public support for five of the second Trump administration’s actions on energy, and whether these effects vary by political beliefs and education. Overall, I found that the Trump cue, but not the climate cue, increased support for Trump’s actions among conservative Republicans, while liberal Democrats and less-educated respondents were largely unresponsive to either cue.</w:t>
       </w:r>
     </w:p>
     <w:p>
@@ -5194,7 +5200,19 @@
         <w:pStyle w:val="BodyText"/>
       </w:pPr>
       <w:r>
-        <w:t xml:space="preserve">Consistent with H1, conservative Republicans exposed to the Trump cue were significantly more supportive of opening federal lands to coal leasing and of shortening the regulatory timeline for nuclear power construction, with marginally significant increases in support for keeping coal plants open and cancelling the offshore wind project. This finding is consistent with the expectation that a cue naming Trump specifically activates expressive and cue-receptive partisanship among Republicans</w:t>
+        <w:t xml:space="preserve">Consistent with H1, conservative Republicans exposed to the Trump cue were significantly more supportive of opening federal lands to coal leasing and of shortening the regulatory timeline for nuclear power construction, with marginally significant increases in support for keeping coal plants open and cancelling offshore wind projects.</w:t>
+      </w:r>
+      <w:r>
+        <w:rPr>
+          <w:rStyle w:val="FootnoteReference"/>
+        </w:rPr>
+        <w:footnoteReference w:id="30"/>
+      </w:r>
+      <w:r>
+        <w:t xml:space="preserve"> </w:t>
+      </w:r>
+      <w:r>
+        <w:t xml:space="preserve">This finding is consistent with the expectation that a cue naming Trump specifically activates expressive and cue-receptive partisanship among Republicans</w:t>
       </w:r>
       <w:r>
         <w:t xml:space="preserve"> </w:t>
@@ -5212,7 +5230,19 @@
         <w:t xml:space="preserve">(Nicholson 2012)</w:t>
       </w:r>
       <w:r>
-        <w:t xml:space="preserve">. Notably, however, the Trump cue did not increase Republican support for eliminating tax credits for wind and solar projects. One likely explanation is that eliminating tax credits is the only one of the five actions that directly reduces, rather than expands or maintains, an existing energy program, and this difference in the nature of the action may be an important factor for respondents.</w:t>
+        <w:t xml:space="preserve">. Notably, however, the Trump cue did not increase Republican support for eliminating tax credits for wind and solar projects. One possible explanation is that eliminating tax credits is the only one of the five actions that directly reduces, rather than expands or maintains, an existing energy program, and this difference in the nature of the action may be an important factor for respondents. It may be the case that the public, on average, supports an</w:t>
+      </w:r>
+      <w:r>
+        <w:t xml:space="preserve"> </w:t>
+      </w:r>
+      <w:r>
+        <w:t xml:space="preserve">“all of the above”</w:t>
+      </w:r>
+      <w:r>
+        <w:t xml:space="preserve"> </w:t>
+      </w:r>
+      <w:r>
+        <w:t xml:space="preserve">energy strategy and the removal of support for one type of energy is therefore less supported.</w:t>
       </w:r>
     </w:p>
     <w:p>
@@ -5236,7 +5266,7 @@
         <w:t xml:space="preserve"> </w:t>
       </w:r>
       <w:r>
-        <w:t xml:space="preserve">Republican support for eliminating tax credits, the one action that most directly harms renewable energy deployment. This could be because the climate cue explicitly named coal, wind, and solar energy and warned that the administration’s actions could make climate change worse; for conservative Republicans, this framing may have been credible specifically for an action that curtails renewables, even as it failed to move opinion on the actions involving coal or nuclear. This finding is consistent with research showing that cue and frame effects can depend heavily on how well the cue content matches the specific policy at hand</w:t>
+        <w:t xml:space="preserve">Republican support for eliminating tax credits, the one action that most directly harms renewable energy deployment. This could be because the climate cue explicitly named coal, wind, and solar energy and warned that the administration’s actions could make climate change worse. For conservative Republicans, this framing may have been credible specifically for an action that curtails renewables, even as it failed to move opinion on the actions involving coal or nuclear. This finding is consistent with research showing that cue and frame effects can depend heavily on how well the cue content matches the specific policy at hand</w:t>
       </w:r>
       <w:r>
         <w:t xml:space="preserve"> </w:t>
@@ -5245,7 +5275,7 @@
         <w:t xml:space="preserve">(Feldman and Hart 2018)</w:t>
       </w:r>
       <w:r>
-        <w:t xml:space="preserve">, rather than operating as a uniform signal.</w:t>
+        <w:t xml:space="preserve">. In addition, the nature of the policy itself may have played a role. It may be the case that conservative Republicans favor (or oppose less) taxes as policy instruments, rather than regulations.</w:t>
       </w:r>
     </w:p>
     <w:p>
@@ -5262,7 +5292,7 @@
         <w:t xml:space="preserve">(Merkley and Stecula 2021)</w:t>
       </w:r>
       <w:r>
-        <w:t xml:space="preserve">. It may also reflect a floor effect: because Democrats’ opposition to actions such as coal leasing and tax credit elimination was likely already near the floor of the response scale in the control condition, there was less room for either cue to move their opinions further.</w:t>
+        <w:t xml:space="preserve">. It may also reflect a floor effect, because Democrats’ opposition to actions such as coal leasing and tax credit elimination was likely already near the floor of the response scale in the control condition, there was less room for either cue to move their opinions further.</w:t>
       </w:r>
     </w:p>
     <w:p>
@@ -5300,7 +5330,7 @@
         <w:t xml:space="preserve">(Vrânceanu 2022)</w:t>
       </w:r>
       <w:r>
-        <w:t xml:space="preserve">. More broadly, this pattern is consistent with survey-experimental evidence that cues from high-profile partisan officials chiefly widen partisan polarization rather than persuade respondents to cross into out-group territory, regardless of respondents’ education</w:t>
+        <w:t xml:space="preserve">. More broadly, this pattern is consistent with survey-experimental evidence that shows that cues from high-profile partisan officials largely widen partisan polarization rather than persuade respondents to cross into out-group territory, regardless of respondents’ education</w:t>
       </w:r>
       <w:r>
         <w:t xml:space="preserve"> </w:t>
@@ -5317,7 +5347,7 @@
         <w:pStyle w:val="BodyText"/>
       </w:pPr>
       <w:r>
-        <w:t xml:space="preserve">Although education did not moderate either cue’s effect, it did independently condition support among the most ideologically committed respondents, in a two-way interaction with political beliefs. Conservative Republicans and liberal Democrats with a college degree were both less supportive than their non-college co-partisans of cancelling the nearly complete offshore wind project and of shortening the nuclear licensing timeline, and college-educated liberal Democrats were also less supportive of eliminating the wind and solar tax credits. This pattern runs opposite to the effect of a college degree among moderate and other respondents, for whom education is associated with greater, not lower, support for these same actions. This suggests that a college degree does not shift support for Trump’s energy actions uniformly but instead interacts with political beliefs, dampening support among committed partisans on both sides while raising it among those without a strong partisan or ideological attachment.</w:t>
+        <w:t xml:space="preserve">Although education did not moderate either cue’s effect, it did independently condition support among the most ideologically committed respondents. This is shown in the significant two-way interactions with political beliefs. Conservative Republicans and liberal Democrats with a college degree were both less supportive than their non-college co-partisans of cancelling the nearly complete offshore wind project and of shortening the nuclear licensing timeline, and college-educated liberal Democrats were also less supportive of eliminating the wind and solar tax credits. This pattern runs opposite to the effect of a college degree among moderate and other respondents, for whom education is associated with greater, not lower, support for these same actions. This suggests that a college degree does not shift support for Trump’s energy actions uniformly but instead interacts with political beliefs, dampening support among committed partisans on both sides while raising it among those without a strong partisan or ideological attachment.</w:t>
       </w:r>
     </w:p>
     <w:p>
@@ -5337,7 +5367,7 @@
         <w:t xml:space="preserve"> </w:t>
       </w:r>
       <w:r>
-        <w:t xml:space="preserve">ideological-consistency model, in which more educated liberals hold more strongly pro-environmental positions than their less educated co-partisans. The pattern among conservative Republicans, however, runs opposite to what that model would predict, as more educated Republicans were less, not more, supportive of actions that curtail wind energy and nuclear expansion specifically. This suggests that education’s role in amplifying partisan-consistent positions on energy may not be symmetric across parties, an asymmetry consistent with this study’s broader finding that the climate and Trump cues themselves affected Republicans and Democrats differently.</w:t>
+        <w:t xml:space="preserve">ideological-consistency model, in which more educated liberals hold more strongly pro-environmental positions than their less educated co-partisans. However, the pattern among conservative Republicans runs opposite to expectations, as more educated Republicans were less, not more, supportive of actions that curtail wind energy and nuclear expansion specifically. This suggests that education’s role in amplifying partisan-consistent positions on energy may not be symmetric across parties, an asymmetry consistent with the broader finding that the climate and Trump cues themselves affected Republicans and Democrats differently.</w:t>
       </w:r>
     </w:p>
     <w:p>
@@ -5345,7 +5375,7 @@
         <w:pStyle w:val="BodyText"/>
       </w:pPr>
       <w:r>
-        <w:t xml:space="preserve">Together, these findings suggest that Trump’s actions on energy are most likely to further polarize public opinion through their association with Trump himself, rather than through their connection to climate change. This is broadly consistent with the pattern of source-specific polarization found in the literature. The actions that showed the clearest Trump cue effects, coal leasing and nuclear licensing, involve energy sources where Republican support was already primed to move</w:t>
+        <w:t xml:space="preserve">Together, these findings suggest that Trump’s actions on energy are most likely to further polarize public opinion through their association with Trump himself, rather than through their connection to climate change. This is broadly consistent with the pattern of source-specific polarization found in the broader literature. The actions that showed the clearest Trump cue effects, coal leasing and nuclear licensing, involve energy sources where Republican support was already primed to move</w:t>
       </w:r>
       <w:r>
         <w:t xml:space="preserve"> </w:t>
@@ -5375,7 +5405,7 @@
         <w:t xml:space="preserve"> </w:t>
       </w:r>
       <w:r>
-        <w:t xml:space="preserve">into the domain of energy policy specifically.</w:t>
+        <w:t xml:space="preserve">into the domain of energy policy.</w:t>
       </w:r>
     </w:p>
     <w:p>
@@ -5402,2926 +5432,6 @@
         <w:t xml:space="preserve">Overall, this study provides experimental evidence that a cue identifying an energy action as coming from the Trump administration, rather than a cue linking the action to climate change, is the more consistent driver of polarized views on the second Trump administration’s approach to energy. As the administration continues to reshape federal energy policy, these results suggest that public reactions to specific actions are likely to be structured more by attitudes toward Trump himself than by their connection to climate change, at least among conservative Republicans.</w:t>
       </w:r>
     </w:p>
-    <w:p>
-      <w:r>
-        <w:br w:type="page"/>
-      </w:r>
-    </w:p>
-    <w:bookmarkEnd w:id="29"/>
-    <w:bookmarkStart w:id="31" w:name="appendix"/>
-    <w:p>
-      <w:pPr>
-        <w:pStyle w:val="Heading1"/>
-      </w:pPr>
-      <w:r>
-        <w:t xml:space="preserve">Appendix</w:t>
-      </w:r>
-    </w:p>
-    <w:tbl>
-      <w:tblPr>
-        <w:tblStyle w:val="Table"/>
-        <w:tblW w:type="pct" w:w="5000"/>
-        <w:tblLayout w:type="fixed"/>
-        <w:tblLook w:firstRow="0" w:lastRow="0" w:firstColumn="0" w:lastColumn="0" w:noHBand="0" w:noVBand="0" w:val="0000"/>
-      </w:tblPr>
-      <w:tblGrid>
-        <w:gridCol w:w="7920"/>
-      </w:tblGrid>
-      <w:tr>
-        <w:tc>
-          <w:tcPr/>
-          <w:bookmarkStart w:id="30" w:name="tbl-results-explore"/>
-          <w:p>
-            <w:pPr>
-              <w:jc w:val="center"/>
-            </w:pPr>
-            <w:pPr>
-              <w:jc w:val="left"/>
-              <w:spacing w:before="200"/>
-              <w:pStyle w:val="ImageCaption"/>
-            </w:pPr>
-            <w:r>
-              <w:t xml:space="preserve">Table 4: Exploratory Model: Climate Cue x Education (Not Preregistered)</w:t>
-            </w:r>
-          </w:p>
-          <w:tbl>
-            <w:tblPr>
-              <w:tblStyle w:val="Table"/>
-              <w:tblW w:type="pct" w:w="4798"/>
-              <w:tblLayout w:type="fixed"/>
-              <w:tblLook w:firstRow="1" w:lastRow="1" w:firstColumn="0" w:lastColumn="0" w:noHBand="0" w:noVBand="0" w:val="0020"/>
-            </w:tblPr>
-            <w:tblGrid>
-              <w:gridCol w:w="2320"/>
-              <w:gridCol w:w="1120"/>
-              <w:gridCol w:w="960"/>
-              <w:gridCol w:w="1200"/>
-              <w:gridCol w:w="1120"/>
-              <w:gridCol w:w="880"/>
-            </w:tblGrid>
-            <w:tr>
-              <w:trPr>
-                <w:tblHeader w:val="on"/>
-              </w:trPr>
-              <w:tc>
-                <w:tcPr/>
-                <w:p>
-                  <w:pPr>
-                    <w:pStyle w:val="Compact"/>
-                  </w:pPr>
-                </w:p>
-              </w:tc>
-              <w:tc>
-                <w:tcPr/>
-                <w:p>
-                  <w:pPr>
-                    <w:pStyle w:val="Compact"/>
-                    <w:jc w:val="center"/>
-                  </w:pPr>
-                  <w:r>
-                    <w:t xml:space="preserve">Tax Credits</w:t>
-                  </w:r>
-                </w:p>
-              </w:tc>
-              <w:tc>
-                <w:tcPr/>
-                <w:p>
-                  <w:pPr>
-                    <w:pStyle w:val="Compact"/>
-                    <w:jc w:val="center"/>
-                  </w:pPr>
-                  <w:r>
-                    <w:t xml:space="preserve">Coal Open</w:t>
-                  </w:r>
-                </w:p>
-              </w:tc>
-              <w:tc>
-                <w:tcPr/>
-                <w:p>
-                  <w:pPr>
-                    <w:pStyle w:val="Compact"/>
-                    <w:jc w:val="center"/>
-                  </w:pPr>
-                  <w:r>
-                    <w:t xml:space="preserve">Coal Leasing</w:t>
-                  </w:r>
-                </w:p>
-              </w:tc>
-              <w:tc>
-                <w:tcPr/>
-                <w:p>
-                  <w:pPr>
-                    <w:pStyle w:val="Compact"/>
-                    <w:jc w:val="center"/>
-                  </w:pPr>
-                  <w:r>
-                    <w:t xml:space="preserve">Cancel Wind</w:t>
-                  </w:r>
-                </w:p>
-              </w:tc>
-              <w:tc>
-                <w:tcPr/>
-                <w:p>
-                  <w:pPr>
-                    <w:pStyle w:val="Compact"/>
-                    <w:jc w:val="center"/>
-                  </w:pPr>
-                  <w:r>
-                    <w:t xml:space="preserve">Nuclear</w:t>
-                  </w:r>
-                </w:p>
-              </w:tc>
-            </w:tr>
-            <w:tr>
-              <w:tc>
-                <w:tcPr/>
-                <w:p>
-                  <w:pPr>
-                    <w:pStyle w:val="Compact"/>
-                    <w:jc w:val="center"/>
-                  </w:pPr>
-                  <w:r>
-                    <w:t xml:space="preserve">Trump Cue</w:t>
-                  </w:r>
-                </w:p>
-              </w:tc>
-              <w:tc>
-                <w:tcPr/>
-                <w:p>
-                  <w:pPr>
-                    <w:pStyle w:val="Compact"/>
-                    <w:jc w:val="center"/>
-                  </w:pPr>
-                  <w:r>
-                    <w:t xml:space="preserve">-0.003</w:t>
-                  </w:r>
-                </w:p>
-              </w:tc>
-              <w:tc>
-                <w:tcPr/>
-                <w:p>
-                  <w:pPr>
-                    <w:pStyle w:val="Compact"/>
-                    <w:jc w:val="center"/>
-                  </w:pPr>
-                  <w:r>
-                    <w:t xml:space="preserve">-0.043</w:t>
-                  </w:r>
-                </w:p>
-              </w:tc>
-              <w:tc>
-                <w:tcPr/>
-                <w:p>
-                  <w:pPr>
-                    <w:pStyle w:val="Compact"/>
-                    <w:jc w:val="center"/>
-                  </w:pPr>
-                  <w:r>
-                    <w:t xml:space="preserve">-0.080</w:t>
-                  </w:r>
-                </w:p>
-              </w:tc>
-              <w:tc>
-                <w:tcPr/>
-                <w:p>
-                  <w:pPr>
-                    <w:pStyle w:val="Compact"/>
-                    <w:jc w:val="center"/>
-                  </w:pPr>
-                  <w:r>
-                    <w:t xml:space="preserve">-0.025</w:t>
-                  </w:r>
-                </w:p>
-              </w:tc>
-              <w:tc>
-                <w:tcPr/>
-                <w:p>
-                  <w:pPr>
-                    <w:pStyle w:val="Compact"/>
-                    <w:jc w:val="center"/>
-                  </w:pPr>
-                  <w:r>
-                    <w:t xml:space="preserve">-0.318†</w:t>
-                  </w:r>
-                </w:p>
-              </w:tc>
-            </w:tr>
-            <w:tr>
-              <w:tc>
-                <w:tcPr/>
-                <w:p>
-                  <w:pPr>
-                    <w:pStyle w:val="Compact"/>
-                  </w:pPr>
-                </w:p>
-              </w:tc>
-              <w:tc>
-                <w:tcPr/>
-                <w:p>
-                  <w:pPr>
-                    <w:pStyle w:val="Compact"/>
-                    <w:jc w:val="center"/>
-                  </w:pPr>
-                  <w:r>
-                    <w:t xml:space="preserve">(0.143)</w:t>
-                  </w:r>
-                </w:p>
-              </w:tc>
-              <w:tc>
-                <w:tcPr/>
-                <w:p>
-                  <w:pPr>
-                    <w:pStyle w:val="Compact"/>
-                    <w:jc w:val="center"/>
-                  </w:pPr>
-                  <w:r>
-                    <w:t xml:space="preserve">(0.150)</w:t>
-                  </w:r>
-                </w:p>
-              </w:tc>
-              <w:tc>
-                <w:tcPr/>
-                <w:p>
-                  <w:pPr>
-                    <w:pStyle w:val="Compact"/>
-                    <w:jc w:val="center"/>
-                  </w:pPr>
-                  <w:r>
-                    <w:t xml:space="preserve">(0.154)</w:t>
-                  </w:r>
-                </w:p>
-              </w:tc>
-              <w:tc>
-                <w:tcPr/>
-                <w:p>
-                  <w:pPr>
-                    <w:pStyle w:val="Compact"/>
-                    <w:jc w:val="center"/>
-                  </w:pPr>
-                  <w:r>
-                    <w:t xml:space="preserve">(0.120)</w:t>
-                  </w:r>
-                </w:p>
-              </w:tc>
-              <w:tc>
-                <w:tcPr/>
-                <w:p>
-                  <w:pPr>
-                    <w:pStyle w:val="Compact"/>
-                    <w:jc w:val="center"/>
-                  </w:pPr>
-                  <w:r>
-                    <w:t xml:space="preserve">(0.177)</w:t>
-                  </w:r>
-                </w:p>
-              </w:tc>
-            </w:tr>
-            <w:tr>
-              <w:tc>
-                <w:tcPr/>
-                <w:p>
-                  <w:pPr>
-                    <w:pStyle w:val="Compact"/>
-                    <w:jc w:val="center"/>
-                  </w:pPr>
-                  <w:r>
-                    <w:t xml:space="preserve">Climate Cue</w:t>
-                  </w:r>
-                </w:p>
-              </w:tc>
-              <w:tc>
-                <w:tcPr/>
-                <w:p>
-                  <w:pPr>
-                    <w:pStyle w:val="Compact"/>
-                    <w:jc w:val="center"/>
-                  </w:pPr>
-                  <w:r>
-                    <w:t xml:space="preserve">0.385*</w:t>
-                  </w:r>
-                </w:p>
-              </w:tc>
-              <w:tc>
-                <w:tcPr/>
-                <w:p>
-                  <w:pPr>
-                    <w:pStyle w:val="Compact"/>
-                    <w:jc w:val="center"/>
-                  </w:pPr>
-                  <w:r>
-                    <w:t xml:space="preserve">0.273†</w:t>
-                  </w:r>
-                </w:p>
-              </w:tc>
-              <w:tc>
-                <w:tcPr/>
-                <w:p>
-                  <w:pPr>
-                    <w:pStyle w:val="Compact"/>
-                    <w:jc w:val="center"/>
-                  </w:pPr>
-                  <w:r>
-                    <w:t xml:space="preserve">0.163</w:t>
-                  </w:r>
-                </w:p>
-              </w:tc>
-              <w:tc>
-                <w:tcPr/>
-                <w:p>
-                  <w:pPr>
-                    <w:pStyle w:val="Compact"/>
-                    <w:jc w:val="center"/>
-                  </w:pPr>
-                  <w:r>
-                    <w:t xml:space="preserve">0.194</w:t>
-                  </w:r>
-                </w:p>
-              </w:tc>
-              <w:tc>
-                <w:tcPr/>
-                <w:p>
-                  <w:pPr>
-                    <w:pStyle w:val="Compact"/>
-                    <w:jc w:val="center"/>
-                  </w:pPr>
-                  <w:r>
-                    <w:t xml:space="preserve">-0.114</w:t>
-                  </w:r>
-                </w:p>
-              </w:tc>
-            </w:tr>
-            <w:tr>
-              <w:tc>
-                <w:tcPr/>
-                <w:p>
-                  <w:pPr>
-                    <w:pStyle w:val="Compact"/>
-                  </w:pPr>
-                </w:p>
-              </w:tc>
-              <w:tc>
-                <w:tcPr/>
-                <w:p>
-                  <w:pPr>
-                    <w:pStyle w:val="Compact"/>
-                    <w:jc w:val="center"/>
-                  </w:pPr>
-                  <w:r>
-                    <w:t xml:space="preserve">(0.156)</w:t>
-                  </w:r>
-                </w:p>
-              </w:tc>
-              <w:tc>
-                <w:tcPr/>
-                <w:p>
-                  <w:pPr>
-                    <w:pStyle w:val="Compact"/>
-                    <w:jc w:val="center"/>
-                  </w:pPr>
-                  <w:r>
-                    <w:t xml:space="preserve">(0.156)</w:t>
-                  </w:r>
-                </w:p>
-              </w:tc>
-              <w:tc>
-                <w:tcPr/>
-                <w:p>
-                  <w:pPr>
-                    <w:pStyle w:val="Compact"/>
-                    <w:jc w:val="center"/>
-                  </w:pPr>
-                  <w:r>
-                    <w:t xml:space="preserve">(0.149)</w:t>
-                  </w:r>
-                </w:p>
-              </w:tc>
-              <w:tc>
-                <w:tcPr/>
-                <w:p>
-                  <w:pPr>
-                    <w:pStyle w:val="Compact"/>
-                    <w:jc w:val="center"/>
-                  </w:pPr>
-                  <w:r>
-                    <w:t xml:space="preserve">(0.127)</w:t>
-                  </w:r>
-                </w:p>
-              </w:tc>
-              <w:tc>
-                <w:tcPr/>
-                <w:p>
-                  <w:pPr>
-                    <w:pStyle w:val="Compact"/>
-                    <w:jc w:val="center"/>
-                  </w:pPr>
-                  <w:r>
-                    <w:t xml:space="preserve">(0.172)</w:t>
-                  </w:r>
-                </w:p>
-              </w:tc>
-            </w:tr>
-            <w:tr>
-              <w:tc>
-                <w:tcPr/>
-                <w:p>
-                  <w:pPr>
-                    <w:pStyle w:val="Compact"/>
-                    <w:jc w:val="center"/>
-                  </w:pPr>
-                  <w:r>
-                    <w:t xml:space="preserve">Cons. Republican</w:t>
-                  </w:r>
-                </w:p>
-              </w:tc>
-              <w:tc>
-                <w:tcPr/>
-                <w:p>
-                  <w:pPr>
-                    <w:pStyle w:val="Compact"/>
-                    <w:jc w:val="center"/>
-                  </w:pPr>
-                  <w:r>
-                    <w:t xml:space="preserve">1.104***</w:t>
-                  </w:r>
-                </w:p>
-              </w:tc>
-              <w:tc>
-                <w:tcPr/>
-                <w:p>
-                  <w:pPr>
-                    <w:pStyle w:val="Compact"/>
-                    <w:jc w:val="center"/>
-                  </w:pPr>
-                  <w:r>
-                    <w:t xml:space="preserve">0.973***</w:t>
-                  </w:r>
-                </w:p>
-              </w:tc>
-              <w:tc>
-                <w:tcPr/>
-                <w:p>
-                  <w:pPr>
-                    <w:pStyle w:val="Compact"/>
-                    <w:jc w:val="center"/>
-                  </w:pPr>
-                  <w:r>
-                    <w:t xml:space="preserve">0.921***</w:t>
-                  </w:r>
-                </w:p>
-              </w:tc>
-              <w:tc>
-                <w:tcPr/>
-                <w:p>
-                  <w:pPr>
-                    <w:pStyle w:val="Compact"/>
-                    <w:jc w:val="center"/>
-                  </w:pPr>
-                  <w:r>
-                    <w:t xml:space="preserve">1.093***</w:t>
-                  </w:r>
-                </w:p>
-              </w:tc>
-              <w:tc>
-                <w:tcPr/>
-                <w:p>
-                  <w:pPr>
-                    <w:pStyle w:val="Compact"/>
-                    <w:jc w:val="center"/>
-                  </w:pPr>
-                  <w:r>
-                    <w:t xml:space="preserve">0.481**</w:t>
-                  </w:r>
-                </w:p>
-              </w:tc>
-            </w:tr>
-            <w:tr>
-              <w:tc>
-                <w:tcPr/>
-                <w:p>
-                  <w:pPr>
-                    <w:pStyle w:val="Compact"/>
-                  </w:pPr>
-                </w:p>
-              </w:tc>
-              <w:tc>
-                <w:tcPr/>
-                <w:p>
-                  <w:pPr>
-                    <w:pStyle w:val="Compact"/>
-                    <w:jc w:val="center"/>
-                  </w:pPr>
-                  <w:r>
-                    <w:t xml:space="preserve">(0.149)</w:t>
-                  </w:r>
-                </w:p>
-              </w:tc>
-              <w:tc>
-                <w:tcPr/>
-                <w:p>
-                  <w:pPr>
-                    <w:pStyle w:val="Compact"/>
-                    <w:jc w:val="center"/>
-                  </w:pPr>
-                  <w:r>
-                    <w:t xml:space="preserve">(0.150)</w:t>
-                  </w:r>
-                </w:p>
-              </w:tc>
-              <w:tc>
-                <w:tcPr/>
-                <w:p>
-                  <w:pPr>
-                    <w:pStyle w:val="Compact"/>
-                    <w:jc w:val="center"/>
-                  </w:pPr>
-                  <w:r>
-                    <w:t xml:space="preserve">(0.144)</w:t>
-                  </w:r>
-                </w:p>
-              </w:tc>
-              <w:tc>
-                <w:tcPr/>
-                <w:p>
-                  <w:pPr>
-                    <w:pStyle w:val="Compact"/>
-                    <w:jc w:val="center"/>
-                  </w:pPr>
-                  <w:r>
-                    <w:t xml:space="preserve">(0.144)</w:t>
-                  </w:r>
-                </w:p>
-              </w:tc>
-              <w:tc>
-                <w:tcPr/>
-                <w:p>
-                  <w:pPr>
-                    <w:pStyle w:val="Compact"/>
-                    <w:jc w:val="center"/>
-                  </w:pPr>
-                  <w:r>
-                    <w:t xml:space="preserve">(0.172)</w:t>
-                  </w:r>
-                </w:p>
-              </w:tc>
-            </w:tr>
-            <w:tr>
-              <w:tc>
-                <w:tcPr/>
-                <w:p>
-                  <w:pPr>
-                    <w:pStyle w:val="Compact"/>
-                    <w:jc w:val="center"/>
-                  </w:pPr>
-                  <w:r>
-                    <w:t xml:space="preserve">Lib. Democrat</w:t>
-                  </w:r>
-                </w:p>
-              </w:tc>
-              <w:tc>
-                <w:tcPr/>
-                <w:p>
-                  <w:pPr>
-                    <w:pStyle w:val="Compact"/>
-                    <w:jc w:val="center"/>
-                  </w:pPr>
-                  <w:r>
-                    <w:t xml:space="preserve">-0.502***</w:t>
-                  </w:r>
-                </w:p>
-              </w:tc>
-              <w:tc>
-                <w:tcPr/>
-                <w:p>
-                  <w:pPr>
-                    <w:pStyle w:val="Compact"/>
-                    <w:jc w:val="center"/>
-                  </w:pPr>
-                  <w:r>
-                    <w:t xml:space="preserve">-0.627***</w:t>
-                  </w:r>
-                </w:p>
-              </w:tc>
-              <w:tc>
-                <w:tcPr/>
-                <w:p>
-                  <w:pPr>
-                    <w:pStyle w:val="Compact"/>
-                    <w:jc w:val="center"/>
-                  </w:pPr>
-                  <w:r>
-                    <w:t xml:space="preserve">-0.597***</w:t>
-                  </w:r>
-                </w:p>
-              </w:tc>
-              <w:tc>
-                <w:tcPr/>
-                <w:p>
-                  <w:pPr>
-                    <w:pStyle w:val="Compact"/>
-                    <w:jc w:val="center"/>
-                  </w:pPr>
-                  <w:r>
-                    <w:t xml:space="preserve">-0.330**</w:t>
-                  </w:r>
-                </w:p>
-              </w:tc>
-              <w:tc>
-                <w:tcPr/>
-                <w:p>
-                  <w:pPr>
-                    <w:pStyle w:val="Compact"/>
-                    <w:jc w:val="center"/>
-                  </w:pPr>
-                  <w:r>
-                    <w:t xml:space="preserve">-0.424**</w:t>
-                  </w:r>
-                </w:p>
-              </w:tc>
-            </w:tr>
-            <w:tr>
-              <w:tc>
-                <w:tcPr/>
-                <w:p>
-                  <w:pPr>
-                    <w:pStyle w:val="Compact"/>
-                  </w:pPr>
-                </w:p>
-              </w:tc>
-              <w:tc>
-                <w:tcPr/>
-                <w:p>
-                  <w:pPr>
-                    <w:pStyle w:val="Compact"/>
-                    <w:jc w:val="center"/>
-                  </w:pPr>
-                  <w:r>
-                    <w:t xml:space="preserve">(0.121)</w:t>
-                  </w:r>
-                </w:p>
-              </w:tc>
-              <w:tc>
-                <w:tcPr/>
-                <w:p>
-                  <w:pPr>
-                    <w:pStyle w:val="Compact"/>
-                    <w:jc w:val="center"/>
-                  </w:pPr>
-                  <w:r>
-                    <w:t xml:space="preserve">(0.130)</w:t>
-                  </w:r>
-                </w:p>
-              </w:tc>
-              <w:tc>
-                <w:tcPr/>
-                <w:p>
-                  <w:pPr>
-                    <w:pStyle w:val="Compact"/>
-                    <w:jc w:val="center"/>
-                  </w:pPr>
-                  <w:r>
-                    <w:t xml:space="preserve">(0.128)</w:t>
-                  </w:r>
-                </w:p>
-              </w:tc>
-              <w:tc>
-                <w:tcPr/>
-                <w:p>
-                  <w:pPr>
-                    <w:pStyle w:val="Compact"/>
-                    <w:jc w:val="center"/>
-                  </w:pPr>
-                  <w:r>
-                    <w:t xml:space="preserve">(0.104)</w:t>
-                  </w:r>
-                </w:p>
-              </w:tc>
-              <w:tc>
-                <w:tcPr/>
-                <w:p>
-                  <w:pPr>
-                    <w:pStyle w:val="Compact"/>
-                    <w:jc w:val="center"/>
-                  </w:pPr>
-                  <w:r>
-                    <w:t xml:space="preserve">(0.155)</w:t>
-                  </w:r>
-                </w:p>
-              </w:tc>
-            </w:tr>
-            <w:tr>
-              <w:tc>
-                <w:tcPr/>
-                <w:p>
-                  <w:pPr>
-                    <w:pStyle w:val="Compact"/>
-                    <w:jc w:val="center"/>
-                  </w:pPr>
-                  <w:r>
-                    <w:t xml:space="preserve">College</w:t>
-                  </w:r>
-                </w:p>
-              </w:tc>
-              <w:tc>
-                <w:tcPr/>
-                <w:p>
-                  <w:pPr>
-                    <w:pStyle w:val="Compact"/>
-                    <w:jc w:val="center"/>
-                  </w:pPr>
-                  <w:r>
-                    <w:t xml:space="preserve">0.269†</w:t>
-                  </w:r>
-                </w:p>
-              </w:tc>
-              <w:tc>
-                <w:tcPr/>
-                <w:p>
-                  <w:pPr>
-                    <w:pStyle w:val="Compact"/>
-                    <w:jc w:val="center"/>
-                  </w:pPr>
-                  <w:r>
-                    <w:t xml:space="preserve">0.174</w:t>
-                  </w:r>
-                </w:p>
-              </w:tc>
-              <w:tc>
-                <w:tcPr/>
-                <w:p>
-                  <w:pPr>
-                    <w:pStyle w:val="Compact"/>
-                    <w:jc w:val="center"/>
-                  </w:pPr>
-                  <w:r>
-                    <w:t xml:space="preserve">0.141</w:t>
-                  </w:r>
-                </w:p>
-              </w:tc>
-              <w:tc>
-                <w:tcPr/>
-                <w:p>
-                  <w:pPr>
-                    <w:pStyle w:val="Compact"/>
-                    <w:jc w:val="center"/>
-                  </w:pPr>
-                  <w:r>
-                    <w:t xml:space="preserve">0.315*</w:t>
-                  </w:r>
-                </w:p>
-              </w:tc>
-              <w:tc>
-                <w:tcPr/>
-                <w:p>
-                  <w:pPr>
-                    <w:pStyle w:val="Compact"/>
-                    <w:jc w:val="center"/>
-                  </w:pPr>
-                  <w:r>
-                    <w:t xml:space="preserve">0.281†</w:t>
-                  </w:r>
-                </w:p>
-              </w:tc>
-            </w:tr>
-            <w:tr>
-              <w:tc>
-                <w:tcPr/>
-                <w:p>
-                  <w:pPr>
-                    <w:pStyle w:val="Compact"/>
-                  </w:pPr>
-                </w:p>
-              </w:tc>
-              <w:tc>
-                <w:tcPr/>
-                <w:p>
-                  <w:pPr>
-                    <w:pStyle w:val="Compact"/>
-                    <w:jc w:val="center"/>
-                  </w:pPr>
-                  <w:r>
-                    <w:t xml:space="preserve">(0.151)</w:t>
-                  </w:r>
-                </w:p>
-              </w:tc>
-              <w:tc>
-                <w:tcPr/>
-                <w:p>
-                  <w:pPr>
-                    <w:pStyle w:val="Compact"/>
-                    <w:jc w:val="center"/>
-                  </w:pPr>
-                  <w:r>
-                    <w:t xml:space="preserve">(0.161)</w:t>
-                  </w:r>
-                </w:p>
-              </w:tc>
-              <w:tc>
-                <w:tcPr/>
-                <w:p>
-                  <w:pPr>
-                    <w:pStyle w:val="Compact"/>
-                    <w:jc w:val="center"/>
-                  </w:pPr>
-                  <w:r>
-                    <w:t xml:space="preserve">(0.149)</w:t>
-                  </w:r>
-                </w:p>
-              </w:tc>
-              <w:tc>
-                <w:tcPr/>
-                <w:p>
-                  <w:pPr>
-                    <w:pStyle w:val="Compact"/>
-                    <w:jc w:val="center"/>
-                  </w:pPr>
-                  <w:r>
-                    <w:t xml:space="preserve">(0.158)</w:t>
-                  </w:r>
-                </w:p>
-              </w:tc>
-              <w:tc>
-                <w:tcPr/>
-                <w:p>
-                  <w:pPr>
-                    <w:pStyle w:val="Compact"/>
-                    <w:jc w:val="center"/>
-                  </w:pPr>
-                  <w:r>
-                    <w:t xml:space="preserve">(0.159)</w:t>
-                  </w:r>
-                </w:p>
-              </w:tc>
-            </w:tr>
-            <w:tr>
-              <w:tc>
-                <w:tcPr/>
-                <w:p>
-                  <w:pPr>
-                    <w:pStyle w:val="Compact"/>
-                    <w:jc w:val="center"/>
-                  </w:pPr>
-                  <w:r>
-                    <w:t xml:space="preserve">Trump x ConRep</w:t>
-                  </w:r>
-                </w:p>
-              </w:tc>
-              <w:tc>
-                <w:tcPr/>
-                <w:p>
-                  <w:pPr>
-                    <w:pStyle w:val="Compact"/>
-                    <w:jc w:val="center"/>
-                  </w:pPr>
-                  <w:r>
-                    <w:t xml:space="preserve">0.334</w:t>
-                  </w:r>
-                </w:p>
-              </w:tc>
-              <w:tc>
-                <w:tcPr/>
-                <w:p>
-                  <w:pPr>
-                    <w:pStyle w:val="Compact"/>
-                    <w:jc w:val="center"/>
-                  </w:pPr>
-                  <w:r>
-                    <w:t xml:space="preserve">0.343</w:t>
-                  </w:r>
-                </w:p>
-              </w:tc>
-              <w:tc>
-                <w:tcPr/>
-                <w:p>
-                  <w:pPr>
-                    <w:pStyle w:val="Compact"/>
-                    <w:jc w:val="center"/>
-                  </w:pPr>
-                  <w:r>
-                    <w:t xml:space="preserve">0.468*</w:t>
-                  </w:r>
-                </w:p>
-              </w:tc>
-              <w:tc>
-                <w:tcPr/>
-                <w:p>
-                  <w:pPr>
-                    <w:pStyle w:val="Compact"/>
-                    <w:jc w:val="center"/>
-                  </w:pPr>
-                  <w:r>
-                    <w:t xml:space="preserve">0.370†</w:t>
-                  </w:r>
-                </w:p>
-              </w:tc>
-              <w:tc>
-                <w:tcPr/>
-                <w:p>
-                  <w:pPr>
-                    <w:pStyle w:val="Compact"/>
-                    <w:jc w:val="center"/>
-                  </w:pPr>
-                  <w:r>
-                    <w:t xml:space="preserve">0.579*</w:t>
-                  </w:r>
-                </w:p>
-              </w:tc>
-            </w:tr>
-            <w:tr>
-              <w:tc>
-                <w:tcPr/>
-                <w:p>
-                  <w:pPr>
-                    <w:pStyle w:val="Compact"/>
-                  </w:pPr>
-                </w:p>
-              </w:tc>
-              <w:tc>
-                <w:tcPr/>
-                <w:p>
-                  <w:pPr>
-                    <w:pStyle w:val="Compact"/>
-                    <w:jc w:val="center"/>
-                  </w:pPr>
-                  <w:r>
-                    <w:t xml:space="preserve">(0.219)</w:t>
-                  </w:r>
-                </w:p>
-              </w:tc>
-              <w:tc>
-                <w:tcPr/>
-                <w:p>
-                  <w:pPr>
-                    <w:pStyle w:val="Compact"/>
-                    <w:jc w:val="center"/>
-                  </w:pPr>
-                  <w:r>
-                    <w:t xml:space="preserve">(0.209)</w:t>
-                  </w:r>
-                </w:p>
-              </w:tc>
-              <w:tc>
-                <w:tcPr/>
-                <w:p>
-                  <w:pPr>
-                    <w:pStyle w:val="Compact"/>
-                    <w:jc w:val="center"/>
-                  </w:pPr>
-                  <w:r>
-                    <w:t xml:space="preserve">(0.212)</w:t>
-                  </w:r>
-                </w:p>
-              </w:tc>
-              <w:tc>
-                <w:tcPr/>
-                <w:p>
-                  <w:pPr>
-                    <w:pStyle w:val="Compact"/>
-                    <w:jc w:val="center"/>
-                  </w:pPr>
-                  <w:r>
-                    <w:t xml:space="preserve">(0.218)</w:t>
-                  </w:r>
-                </w:p>
-              </w:tc>
-              <w:tc>
-                <w:tcPr/>
-                <w:p>
-                  <w:pPr>
-                    <w:pStyle w:val="Compact"/>
-                    <w:jc w:val="center"/>
-                  </w:pPr>
-                  <w:r>
-                    <w:t xml:space="preserve">(0.249)</w:t>
-                  </w:r>
-                </w:p>
-              </w:tc>
-            </w:tr>
-            <w:tr>
-              <w:tc>
-                <w:tcPr/>
-                <w:p>
-                  <w:pPr>
-                    <w:pStyle w:val="Compact"/>
-                    <w:jc w:val="center"/>
-                  </w:pPr>
-                  <w:r>
-                    <w:t xml:space="preserve">Climate x ConRep</w:t>
-                  </w:r>
-                </w:p>
-              </w:tc>
-              <w:tc>
-                <w:tcPr/>
-                <w:p>
-                  <w:pPr>
-                    <w:pStyle w:val="Compact"/>
-                    <w:jc w:val="center"/>
-                  </w:pPr>
-                  <w:r>
-                    <w:t xml:space="preserve">-0.419†</w:t>
-                  </w:r>
-                </w:p>
-              </w:tc>
-              <w:tc>
-                <w:tcPr/>
-                <w:p>
-                  <w:pPr>
-                    <w:pStyle w:val="Compact"/>
-                    <w:jc w:val="center"/>
-                  </w:pPr>
-                  <w:r>
-                    <w:t xml:space="preserve">-0.254</w:t>
-                  </w:r>
-                </w:p>
-              </w:tc>
-              <w:tc>
-                <w:tcPr/>
-                <w:p>
-                  <w:pPr>
-                    <w:pStyle w:val="Compact"/>
-                    <w:jc w:val="center"/>
-                  </w:pPr>
-                  <w:r>
-                    <w:t xml:space="preserve">-0.074</w:t>
-                  </w:r>
-                </w:p>
-              </w:tc>
-              <w:tc>
-                <w:tcPr/>
-                <w:p>
-                  <w:pPr>
-                    <w:pStyle w:val="Compact"/>
-                    <w:jc w:val="center"/>
-                  </w:pPr>
-                  <w:r>
-                    <w:t xml:space="preserve">-0.172</w:t>
-                  </w:r>
-                </w:p>
-              </w:tc>
-              <w:tc>
-                <w:tcPr/>
-                <w:p>
-                  <w:pPr>
-                    <w:pStyle w:val="Compact"/>
-                    <w:jc w:val="center"/>
-                  </w:pPr>
-                  <w:r>
-                    <w:t xml:space="preserve">0.282</w:t>
-                  </w:r>
-                </w:p>
-              </w:tc>
-            </w:tr>
-            <w:tr>
-              <w:tc>
-                <w:tcPr/>
-                <w:p>
-                  <w:pPr>
-                    <w:pStyle w:val="Compact"/>
-                  </w:pPr>
-                </w:p>
-              </w:tc>
-              <w:tc>
-                <w:tcPr/>
-                <w:p>
-                  <w:pPr>
-                    <w:pStyle w:val="Compact"/>
-                    <w:jc w:val="center"/>
-                  </w:pPr>
-                  <w:r>
-                    <w:t xml:space="preserve">(0.221)</w:t>
-                  </w:r>
-                </w:p>
-              </w:tc>
-              <w:tc>
-                <w:tcPr/>
-                <w:p>
-                  <w:pPr>
-                    <w:pStyle w:val="Compact"/>
-                    <w:jc w:val="center"/>
-                  </w:pPr>
-                  <w:r>
-                    <w:t xml:space="preserve">(0.210)</w:t>
-                  </w:r>
-                </w:p>
-              </w:tc>
-              <w:tc>
-                <w:tcPr/>
-                <w:p>
-                  <w:pPr>
-                    <w:pStyle w:val="Compact"/>
-                    <w:jc w:val="center"/>
-                  </w:pPr>
-                  <w:r>
-                    <w:t xml:space="preserve">(0.209)</w:t>
-                  </w:r>
-                </w:p>
-              </w:tc>
-              <w:tc>
-                <w:tcPr/>
-                <w:p>
-                  <w:pPr>
-                    <w:pStyle w:val="Compact"/>
-                    <w:jc w:val="center"/>
-                  </w:pPr>
-                  <w:r>
-                    <w:t xml:space="preserve">(0.209)</w:t>
-                  </w:r>
-                </w:p>
-              </w:tc>
-              <w:tc>
-                <w:tcPr/>
-                <w:p>
-                  <w:pPr>
-                    <w:pStyle w:val="Compact"/>
-                    <w:jc w:val="center"/>
-                  </w:pPr>
-                  <w:r>
-                    <w:t xml:space="preserve">(0.238)</w:t>
-                  </w:r>
-                </w:p>
-              </w:tc>
-            </w:tr>
-            <w:tr>
-              <w:tc>
-                <w:tcPr/>
-                <w:p>
-                  <w:pPr>
-                    <w:pStyle w:val="Compact"/>
-                    <w:jc w:val="center"/>
-                  </w:pPr>
-                  <w:r>
-                    <w:t xml:space="preserve">Trump x LibDem</w:t>
-                  </w:r>
-                </w:p>
-              </w:tc>
-              <w:tc>
-                <w:tcPr/>
-                <w:p>
-                  <w:pPr>
-                    <w:pStyle w:val="Compact"/>
-                    <w:jc w:val="center"/>
-                  </w:pPr>
-                  <w:r>
-                    <w:t xml:space="preserve">-0.056</w:t>
-                  </w:r>
-                </w:p>
-              </w:tc>
-              <w:tc>
-                <w:tcPr/>
-                <w:p>
-                  <w:pPr>
-                    <w:pStyle w:val="Compact"/>
-                    <w:jc w:val="center"/>
-                  </w:pPr>
-                  <w:r>
-                    <w:t xml:space="preserve">-0.090</w:t>
-                  </w:r>
-                </w:p>
-              </w:tc>
-              <w:tc>
-                <w:tcPr/>
-                <w:p>
-                  <w:pPr>
-                    <w:pStyle w:val="Compact"/>
-                    <w:jc w:val="center"/>
-                  </w:pPr>
-                  <w:r>
-                    <w:t xml:space="preserve">-0.091</w:t>
-                  </w:r>
-                </w:p>
-              </w:tc>
-              <w:tc>
-                <w:tcPr/>
-                <w:p>
-                  <w:pPr>
-                    <w:pStyle w:val="Compact"/>
-                    <w:jc w:val="center"/>
-                  </w:pPr>
-                  <w:r>
-                    <w:t xml:space="preserve">-0.128</w:t>
-                  </w:r>
-                </w:p>
-              </w:tc>
-              <w:tc>
-                <w:tcPr/>
-                <w:p>
-                  <w:pPr>
-                    <w:pStyle w:val="Compact"/>
-                    <w:jc w:val="center"/>
-                  </w:pPr>
-                  <w:r>
-                    <w:t xml:space="preserve">-0.107</w:t>
-                  </w:r>
-                </w:p>
-              </w:tc>
-            </w:tr>
-            <w:tr>
-              <w:tc>
-                <w:tcPr/>
-                <w:p>
-                  <w:pPr>
-                    <w:pStyle w:val="Compact"/>
-                  </w:pPr>
-                </w:p>
-              </w:tc>
-              <w:tc>
-                <w:tcPr/>
-                <w:p>
-                  <w:pPr>
-                    <w:pStyle w:val="Compact"/>
-                    <w:jc w:val="center"/>
-                  </w:pPr>
-                  <w:r>
-                    <w:t xml:space="preserve">(0.165)</w:t>
-                  </w:r>
-                </w:p>
-              </w:tc>
-              <w:tc>
-                <w:tcPr/>
-                <w:p>
-                  <w:pPr>
-                    <w:pStyle w:val="Compact"/>
-                    <w:jc w:val="center"/>
-                  </w:pPr>
-                  <w:r>
-                    <w:t xml:space="preserve">(0.177)</w:t>
-                  </w:r>
-                </w:p>
-              </w:tc>
-              <w:tc>
-                <w:tcPr/>
-                <w:p>
-                  <w:pPr>
-                    <w:pStyle w:val="Compact"/>
-                    <w:jc w:val="center"/>
-                  </w:pPr>
-                  <w:r>
-                    <w:t xml:space="preserve">(0.181)</w:t>
-                  </w:r>
-                </w:p>
-              </w:tc>
-              <w:tc>
-                <w:tcPr/>
-                <w:p>
-                  <w:pPr>
-                    <w:pStyle w:val="Compact"/>
-                    <w:jc w:val="center"/>
-                  </w:pPr>
-                  <w:r>
-                    <w:t xml:space="preserve">(0.140)</w:t>
-                  </w:r>
-                </w:p>
-              </w:tc>
-              <w:tc>
-                <w:tcPr/>
-                <w:p>
-                  <w:pPr>
-                    <w:pStyle w:val="Compact"/>
-                    <w:jc w:val="center"/>
-                  </w:pPr>
-                  <w:r>
-                    <w:t xml:space="preserve">(0.218)</w:t>
-                  </w:r>
-                </w:p>
-              </w:tc>
-            </w:tr>
-            <w:tr>
-              <w:tc>
-                <w:tcPr/>
-                <w:p>
-                  <w:pPr>
-                    <w:pStyle w:val="Compact"/>
-                    <w:jc w:val="center"/>
-                  </w:pPr>
-                  <w:r>
-                    <w:t xml:space="preserve">Climate x LibDem</w:t>
-                  </w:r>
-                </w:p>
-              </w:tc>
-              <w:tc>
-                <w:tcPr/>
-                <w:p>
-                  <w:pPr>
-                    <w:pStyle w:val="Compact"/>
-                    <w:jc w:val="center"/>
-                  </w:pPr>
-                  <w:r>
-                    <w:t xml:space="preserve">-0.222</w:t>
-                  </w:r>
-                </w:p>
-              </w:tc>
-              <w:tc>
-                <w:tcPr/>
-                <w:p>
-                  <w:pPr>
-                    <w:pStyle w:val="Compact"/>
-                    <w:jc w:val="center"/>
-                  </w:pPr>
-                  <w:r>
-                    <w:t xml:space="preserve">-0.216</w:t>
-                  </w:r>
-                </w:p>
-              </w:tc>
-              <w:tc>
-                <w:tcPr/>
-                <w:p>
-                  <w:pPr>
-                    <w:pStyle w:val="Compact"/>
-                    <w:jc w:val="center"/>
-                  </w:pPr>
-                  <w:r>
-                    <w:t xml:space="preserve">-0.120</w:t>
-                  </w:r>
-                </w:p>
-              </w:tc>
-              <w:tc>
-                <w:tcPr/>
-                <w:p>
-                  <w:pPr>
-                    <w:pStyle w:val="Compact"/>
-                    <w:jc w:val="center"/>
-                  </w:pPr>
-                  <w:r>
-                    <w:t xml:space="preserve">-0.144</w:t>
-                  </w:r>
-                </w:p>
-              </w:tc>
-              <w:tc>
-                <w:tcPr/>
-                <w:p>
-                  <w:pPr>
-                    <w:pStyle w:val="Compact"/>
-                    <w:jc w:val="center"/>
-                  </w:pPr>
-                  <w:r>
-                    <w:t xml:space="preserve">0.191</w:t>
-                  </w:r>
-                </w:p>
-              </w:tc>
-            </w:tr>
-            <w:tr>
-              <w:tc>
-                <w:tcPr/>
-                <w:p>
-                  <w:pPr>
-                    <w:pStyle w:val="Compact"/>
-                  </w:pPr>
-                </w:p>
-              </w:tc>
-              <w:tc>
-                <w:tcPr/>
-                <w:p>
-                  <w:pPr>
-                    <w:pStyle w:val="Compact"/>
-                    <w:jc w:val="center"/>
-                  </w:pPr>
-                  <w:r>
-                    <w:t xml:space="preserve">(0.187)</w:t>
-                  </w:r>
-                </w:p>
-              </w:tc>
-              <w:tc>
-                <w:tcPr/>
-                <w:p>
-                  <w:pPr>
-                    <w:pStyle w:val="Compact"/>
-                    <w:jc w:val="center"/>
-                  </w:pPr>
-                  <w:r>
-                    <w:t xml:space="preserve">(0.190)</w:t>
-                  </w:r>
-                </w:p>
-              </w:tc>
-              <w:tc>
-                <w:tcPr/>
-                <w:p>
-                  <w:pPr>
-                    <w:pStyle w:val="Compact"/>
-                    <w:jc w:val="center"/>
-                  </w:pPr>
-                  <w:r>
-                    <w:t xml:space="preserve">(0.181)</w:t>
-                  </w:r>
-                </w:p>
-              </w:tc>
-              <w:tc>
-                <w:tcPr/>
-                <w:p>
-                  <w:pPr>
-                    <w:pStyle w:val="Compact"/>
-                    <w:jc w:val="center"/>
-                  </w:pPr>
-                  <w:r>
-                    <w:t xml:space="preserve">(0.155)</w:t>
-                  </w:r>
-                </w:p>
-              </w:tc>
-              <w:tc>
-                <w:tcPr/>
-                <w:p>
-                  <w:pPr>
-                    <w:pStyle w:val="Compact"/>
-                    <w:jc w:val="center"/>
-                  </w:pPr>
-                  <w:r>
-                    <w:t xml:space="preserve">(0.215)</w:t>
-                  </w:r>
-                </w:p>
-              </w:tc>
-            </w:tr>
-            <w:tr>
-              <w:tc>
-                <w:tcPr/>
-                <w:p>
-                  <w:pPr>
-                    <w:pStyle w:val="Compact"/>
-                    <w:jc w:val="center"/>
-                  </w:pPr>
-                  <w:r>
-                    <w:t xml:space="preserve">Trump x College</w:t>
-                  </w:r>
-                </w:p>
-              </w:tc>
-              <w:tc>
-                <w:tcPr/>
-                <w:p>
-                  <w:pPr>
-                    <w:pStyle w:val="Compact"/>
-                    <w:jc w:val="center"/>
-                  </w:pPr>
-                  <w:r>
-                    <w:t xml:space="preserve">-0.026</w:t>
-                  </w:r>
-                </w:p>
-              </w:tc>
-              <w:tc>
-                <w:tcPr/>
-                <w:p>
-                  <w:pPr>
-                    <w:pStyle w:val="Compact"/>
-                    <w:jc w:val="center"/>
-                  </w:pPr>
-                  <w:r>
-                    <w:t xml:space="preserve">-0.056</w:t>
-                  </w:r>
-                </w:p>
-              </w:tc>
-              <w:tc>
-                <w:tcPr/>
-                <w:p>
-                  <w:pPr>
-                    <w:pStyle w:val="Compact"/>
-                    <w:jc w:val="center"/>
-                  </w:pPr>
-                  <w:r>
-                    <w:t xml:space="preserve">0.019</w:t>
-                  </w:r>
-                </w:p>
-              </w:tc>
-              <w:tc>
-                <w:tcPr/>
-                <w:p>
-                  <w:pPr>
-                    <w:pStyle w:val="Compact"/>
-                    <w:jc w:val="center"/>
-                  </w:pPr>
-                  <w:r>
-                    <w:t xml:space="preserve">0.063</w:t>
-                  </w:r>
-                </w:p>
-              </w:tc>
-              <w:tc>
-                <w:tcPr/>
-                <w:p>
-                  <w:pPr>
-                    <w:pStyle w:val="Compact"/>
-                    <w:jc w:val="center"/>
-                  </w:pPr>
-                  <w:r>
-                    <w:t xml:space="preserve">0.174</w:t>
-                  </w:r>
-                </w:p>
-              </w:tc>
-            </w:tr>
-            <w:tr>
-              <w:tc>
-                <w:tcPr/>
-                <w:p>
-                  <w:pPr>
-                    <w:pStyle w:val="Compact"/>
-                  </w:pPr>
-                </w:p>
-              </w:tc>
-              <w:tc>
-                <w:tcPr/>
-                <w:p>
-                  <w:pPr>
-                    <w:pStyle w:val="Compact"/>
-                    <w:jc w:val="center"/>
-                  </w:pPr>
-                  <w:r>
-                    <w:t xml:space="preserve">(0.215)</w:t>
-                  </w:r>
-                </w:p>
-              </w:tc>
-              <w:tc>
-                <w:tcPr/>
-                <w:p>
-                  <w:pPr>
-                    <w:pStyle w:val="Compact"/>
-                    <w:jc w:val="center"/>
-                  </w:pPr>
-                  <w:r>
-                    <w:t xml:space="preserve">(0.218)</w:t>
-                  </w:r>
-                </w:p>
-              </w:tc>
-              <w:tc>
-                <w:tcPr/>
-                <w:p>
-                  <w:pPr>
-                    <w:pStyle w:val="Compact"/>
-                    <w:jc w:val="center"/>
-                  </w:pPr>
-                  <w:r>
-                    <w:t xml:space="preserve">(0.222)</w:t>
-                  </w:r>
-                </w:p>
-              </w:tc>
-              <w:tc>
-                <w:tcPr/>
-                <w:p>
-                  <w:pPr>
-                    <w:pStyle w:val="Compact"/>
-                    <w:jc w:val="center"/>
-                  </w:pPr>
-                  <w:r>
-                    <w:t xml:space="preserve">(0.214)</w:t>
-                  </w:r>
-                </w:p>
-              </w:tc>
-              <w:tc>
-                <w:tcPr/>
-                <w:p>
-                  <w:pPr>
-                    <w:pStyle w:val="Compact"/>
-                    <w:jc w:val="center"/>
-                  </w:pPr>
-                  <w:r>
-                    <w:t xml:space="preserve">(0.231)</w:t>
-                  </w:r>
-                </w:p>
-              </w:tc>
-            </w:tr>
-            <w:tr>
-              <w:tc>
-                <w:tcPr/>
-                <w:p>
-                  <w:pPr>
-                    <w:pStyle w:val="Compact"/>
-                    <w:jc w:val="center"/>
-                  </w:pPr>
-                  <w:r>
-                    <w:t xml:space="preserve">College x ConRep</w:t>
-                  </w:r>
-                </w:p>
-              </w:tc>
-              <w:tc>
-                <w:tcPr/>
-                <w:p>
-                  <w:pPr>
-                    <w:pStyle w:val="Compact"/>
-                    <w:jc w:val="center"/>
-                  </w:pPr>
-                  <w:r>
-                    <w:t xml:space="preserve">-0.186</w:t>
-                  </w:r>
-                </w:p>
-              </w:tc>
-              <w:tc>
-                <w:tcPr/>
-                <w:p>
-                  <w:pPr>
-                    <w:pStyle w:val="Compact"/>
-                    <w:jc w:val="center"/>
-                  </w:pPr>
-                  <w:r>
-                    <w:t xml:space="preserve">-0.220</w:t>
-                  </w:r>
-                </w:p>
-              </w:tc>
-              <w:tc>
-                <w:tcPr/>
-                <w:p>
-                  <w:pPr>
-                    <w:pStyle w:val="Compact"/>
-                    <w:jc w:val="center"/>
-                  </w:pPr>
-                  <w:r>
-                    <w:t xml:space="preserve">-0.133</w:t>
-                  </w:r>
-                </w:p>
-              </w:tc>
-              <w:tc>
-                <w:tcPr/>
-                <w:p>
-                  <w:pPr>
-                    <w:pStyle w:val="Compact"/>
-                    <w:jc w:val="center"/>
-                  </w:pPr>
-                  <w:r>
-                    <w:t xml:space="preserve">-0.277</w:t>
-                  </w:r>
-                </w:p>
-              </w:tc>
-              <w:tc>
-                <w:tcPr/>
-                <w:p>
-                  <w:pPr>
-                    <w:pStyle w:val="Compact"/>
-                    <w:jc w:val="center"/>
-                  </w:pPr>
-                  <w:r>
-                    <w:t xml:space="preserve">-0.100</w:t>
-                  </w:r>
-                </w:p>
-              </w:tc>
-            </w:tr>
-            <w:tr>
-              <w:tc>
-                <w:tcPr/>
-                <w:p>
-                  <w:pPr>
-                    <w:pStyle w:val="Compact"/>
-                  </w:pPr>
-                </w:p>
-              </w:tc>
-              <w:tc>
-                <w:tcPr/>
-                <w:p>
-                  <w:pPr>
-                    <w:pStyle w:val="Compact"/>
-                    <w:jc w:val="center"/>
-                  </w:pPr>
-                  <w:r>
-                    <w:t xml:space="preserve">(0.218)</w:t>
-                  </w:r>
-                </w:p>
-              </w:tc>
-              <w:tc>
-                <w:tcPr/>
-                <w:p>
-                  <w:pPr>
-                    <w:pStyle w:val="Compact"/>
-                    <w:jc w:val="center"/>
-                  </w:pPr>
-                  <w:r>
-                    <w:t xml:space="preserve">(0.213)</w:t>
-                  </w:r>
-                </w:p>
-              </w:tc>
-              <w:tc>
-                <w:tcPr/>
-                <w:p>
-                  <w:pPr>
-                    <w:pStyle w:val="Compact"/>
-                    <w:jc w:val="center"/>
-                  </w:pPr>
-                  <w:r>
-                    <w:t xml:space="preserve">(0.209)</w:t>
-                  </w:r>
-                </w:p>
-              </w:tc>
-              <w:tc>
-                <w:tcPr/>
-                <w:p>
-                  <w:pPr>
-                    <w:pStyle w:val="Compact"/>
-                    <w:jc w:val="center"/>
-                  </w:pPr>
-                  <w:r>
-                    <w:t xml:space="preserve">(0.233)</w:t>
-                  </w:r>
-                </w:p>
-              </w:tc>
-              <w:tc>
-                <w:tcPr/>
-                <w:p>
-                  <w:pPr>
-                    <w:pStyle w:val="Compact"/>
-                    <w:jc w:val="center"/>
-                  </w:pPr>
-                  <w:r>
-                    <w:t xml:space="preserve">(0.235)</w:t>
-                  </w:r>
-                </w:p>
-              </w:tc>
-            </w:tr>
-            <w:tr>
-              <w:tc>
-                <w:tcPr/>
-                <w:p>
-                  <w:pPr>
-                    <w:pStyle w:val="Compact"/>
-                    <w:jc w:val="center"/>
-                  </w:pPr>
-                  <w:r>
-                    <w:t xml:space="preserve">College x LibDem</w:t>
-                  </w:r>
-                </w:p>
-              </w:tc>
-              <w:tc>
-                <w:tcPr/>
-                <w:p>
-                  <w:pPr>
-                    <w:pStyle w:val="Compact"/>
-                    <w:jc w:val="center"/>
-                  </w:pPr>
-                  <w:r>
-                    <w:t xml:space="preserve">-0.263</w:t>
-                  </w:r>
-                </w:p>
-              </w:tc>
-              <w:tc>
-                <w:tcPr/>
-                <w:p>
-                  <w:pPr>
-                    <w:pStyle w:val="Compact"/>
-                    <w:jc w:val="center"/>
-                  </w:pPr>
-                  <w:r>
-                    <w:t xml:space="preserve">-0.227</w:t>
-                  </w:r>
-                </w:p>
-              </w:tc>
-              <w:tc>
-                <w:tcPr/>
-                <w:p>
-                  <w:pPr>
-                    <w:pStyle w:val="Compact"/>
-                    <w:jc w:val="center"/>
-                  </w:pPr>
-                  <w:r>
-                    <w:t xml:space="preserve">-0.234</w:t>
-                  </w:r>
-                </w:p>
-              </w:tc>
-              <w:tc>
-                <w:tcPr/>
-                <w:p>
-                  <w:pPr>
-                    <w:pStyle w:val="Compact"/>
-                    <w:jc w:val="center"/>
-                  </w:pPr>
-                  <w:r>
-                    <w:t xml:space="preserve">-0.408*</w:t>
-                  </w:r>
-                </w:p>
-              </w:tc>
-              <w:tc>
-                <w:tcPr/>
-                <w:p>
-                  <w:pPr>
-                    <w:pStyle w:val="Compact"/>
-                    <w:jc w:val="center"/>
-                  </w:pPr>
-                  <w:r>
-                    <w:t xml:space="preserve">-0.208</w:t>
-                  </w:r>
-                </w:p>
-              </w:tc>
-            </w:tr>
-            <w:tr>
-              <w:tc>
-                <w:tcPr/>
-                <w:p>
-                  <w:pPr>
-                    <w:pStyle w:val="Compact"/>
-                  </w:pPr>
-                </w:p>
-              </w:tc>
-              <w:tc>
-                <w:tcPr/>
-                <w:p>
-                  <w:pPr>
-                    <w:pStyle w:val="Compact"/>
-                    <w:jc w:val="center"/>
-                  </w:pPr>
-                  <w:r>
-                    <w:t xml:space="preserve">(0.173)</w:t>
-                  </w:r>
-                </w:p>
-              </w:tc>
-              <w:tc>
-                <w:tcPr/>
-                <w:p>
-                  <w:pPr>
-                    <w:pStyle w:val="Compact"/>
-                    <w:jc w:val="center"/>
-                  </w:pPr>
-                  <w:r>
-                    <w:t xml:space="preserve">(0.186)</w:t>
-                  </w:r>
-                </w:p>
-              </w:tc>
-              <w:tc>
-                <w:tcPr/>
-                <w:p>
-                  <w:pPr>
-                    <w:pStyle w:val="Compact"/>
-                    <w:jc w:val="center"/>
-                  </w:pPr>
-                  <w:r>
-                    <w:t xml:space="preserve">(0.176)</w:t>
-                  </w:r>
-                </w:p>
-              </w:tc>
-              <w:tc>
-                <w:tcPr/>
-                <w:p>
-                  <w:pPr>
-                    <w:pStyle w:val="Compact"/>
-                    <w:jc w:val="center"/>
-                  </w:pPr>
-                  <w:r>
-                    <w:t xml:space="preserve">(0.173)</w:t>
-                  </w:r>
-                </w:p>
-              </w:tc>
-              <w:tc>
-                <w:tcPr/>
-                <w:p>
-                  <w:pPr>
-                    <w:pStyle w:val="Compact"/>
-                    <w:jc w:val="center"/>
-                  </w:pPr>
-                  <w:r>
-                    <w:t xml:space="preserve">(0.202)</w:t>
-                  </w:r>
-                </w:p>
-              </w:tc>
-            </w:tr>
-            <w:tr>
-              <w:tc>
-                <w:tcPr/>
-                <w:p>
-                  <w:pPr>
-                    <w:pStyle w:val="Compact"/>
-                    <w:jc w:val="center"/>
-                  </w:pPr>
-                  <w:r>
-                    <w:t xml:space="preserve">Trump x ConRep x College</w:t>
-                  </w:r>
-                </w:p>
-              </w:tc>
-              <w:tc>
-                <w:tcPr/>
-                <w:p>
-                  <w:pPr>
-                    <w:pStyle w:val="Compact"/>
-                    <w:jc w:val="center"/>
-                  </w:pPr>
-                  <w:r>
-                    <w:t xml:space="preserve">-0.459</w:t>
-                  </w:r>
-                </w:p>
-              </w:tc>
-              <w:tc>
-                <w:tcPr/>
-                <w:p>
-                  <w:pPr>
-                    <w:pStyle w:val="Compact"/>
-                    <w:jc w:val="center"/>
-                  </w:pPr>
-                  <w:r>
-                    <w:t xml:space="preserve">-0.082</w:t>
-                  </w:r>
-                </w:p>
-              </w:tc>
-              <w:tc>
-                <w:tcPr/>
-                <w:p>
-                  <w:pPr>
-                    <w:pStyle w:val="Compact"/>
-                    <w:jc w:val="center"/>
-                  </w:pPr>
-                  <w:r>
-                    <w:t xml:space="preserve">-0.220</w:t>
-                  </w:r>
-                </w:p>
-              </w:tc>
-              <w:tc>
-                <w:tcPr/>
-                <w:p>
-                  <w:pPr>
-                    <w:pStyle w:val="Compact"/>
-                    <w:jc w:val="center"/>
-                  </w:pPr>
-                  <w:r>
-                    <w:t xml:space="preserve">-0.465</w:t>
-                  </w:r>
-                </w:p>
-              </w:tc>
-              <w:tc>
-                <w:tcPr/>
-                <w:p>
-                  <w:pPr>
-                    <w:pStyle w:val="Compact"/>
-                    <w:jc w:val="center"/>
-                  </w:pPr>
-                  <w:r>
-                    <w:t xml:space="preserve">-0.262</w:t>
-                  </w:r>
-                </w:p>
-              </w:tc>
-            </w:tr>
-            <w:tr>
-              <w:tc>
-                <w:tcPr/>
-                <w:p>
-                  <w:pPr>
-                    <w:pStyle w:val="Compact"/>
-                  </w:pPr>
-                </w:p>
-              </w:tc>
-              <w:tc>
-                <w:tcPr/>
-                <w:p>
-                  <w:pPr>
-                    <w:pStyle w:val="Compact"/>
-                    <w:jc w:val="center"/>
-                  </w:pPr>
-                  <w:r>
-                    <w:t xml:space="preserve">(0.318)</w:t>
-                  </w:r>
-                </w:p>
-              </w:tc>
-              <w:tc>
-                <w:tcPr/>
-                <w:p>
-                  <w:pPr>
-                    <w:pStyle w:val="Compact"/>
-                    <w:jc w:val="center"/>
-                  </w:pPr>
-                  <w:r>
-                    <w:t xml:space="preserve">(0.299)</w:t>
-                  </w:r>
-                </w:p>
-              </w:tc>
-              <w:tc>
-                <w:tcPr/>
-                <w:p>
-                  <w:pPr>
-                    <w:pStyle w:val="Compact"/>
-                    <w:jc w:val="center"/>
-                  </w:pPr>
-                  <w:r>
-                    <w:t xml:space="preserve">(0.312)</w:t>
-                  </w:r>
-                </w:p>
-              </w:tc>
-              <w:tc>
-                <w:tcPr/>
-                <w:p>
-                  <w:pPr>
-                    <w:pStyle w:val="Compact"/>
-                    <w:jc w:val="center"/>
-                  </w:pPr>
-                  <w:r>
-                    <w:t xml:space="preserve">(0.335)</w:t>
-                  </w:r>
-                </w:p>
-              </w:tc>
-              <w:tc>
-                <w:tcPr/>
-                <w:p>
-                  <w:pPr>
-                    <w:pStyle w:val="Compact"/>
-                    <w:jc w:val="center"/>
-                  </w:pPr>
-                  <w:r>
-                    <w:t xml:space="preserve">(0.334)</w:t>
-                  </w:r>
-                </w:p>
-              </w:tc>
-            </w:tr>
-            <w:tr>
-              <w:tc>
-                <w:tcPr/>
-                <w:p>
-                  <w:pPr>
-                    <w:pStyle w:val="Compact"/>
-                    <w:jc w:val="center"/>
-                  </w:pPr>
-                  <w:r>
-                    <w:t xml:space="preserve">Trump x LibDem x College</w:t>
-                  </w:r>
-                </w:p>
-              </w:tc>
-              <w:tc>
-                <w:tcPr/>
-                <w:p>
-                  <w:pPr>
-                    <w:pStyle w:val="Compact"/>
-                    <w:jc w:val="center"/>
-                  </w:pPr>
-                  <w:r>
-                    <w:t xml:space="preserve">-0.027</w:t>
-                  </w:r>
-                </w:p>
-              </w:tc>
-              <w:tc>
-                <w:tcPr/>
-                <w:p>
-                  <w:pPr>
-                    <w:pStyle w:val="Compact"/>
-                    <w:jc w:val="center"/>
-                  </w:pPr>
-                  <w:r>
-                    <w:t xml:space="preserve">0.025</w:t>
-                  </w:r>
-                </w:p>
-              </w:tc>
-              <w:tc>
-                <w:tcPr/>
-                <w:p>
-                  <w:pPr>
-                    <w:pStyle w:val="Compact"/>
-                    <w:jc w:val="center"/>
-                  </w:pPr>
-                  <w:r>
-                    <w:t xml:space="preserve">-0.042</w:t>
-                  </w:r>
-                </w:p>
-              </w:tc>
-              <w:tc>
-                <w:tcPr/>
-                <w:p>
-                  <w:pPr>
-                    <w:pStyle w:val="Compact"/>
-                    <w:jc w:val="center"/>
-                  </w:pPr>
-                  <w:r>
-                    <w:t xml:space="preserve">0.024</w:t>
-                  </w:r>
-                </w:p>
-              </w:tc>
-              <w:tc>
-                <w:tcPr/>
-                <w:p>
-                  <w:pPr>
-                    <w:pStyle w:val="Compact"/>
-                    <w:jc w:val="center"/>
-                  </w:pPr>
-                  <w:r>
-                    <w:t xml:space="preserve">-0.094</w:t>
-                  </w:r>
-                </w:p>
-              </w:tc>
-            </w:tr>
-            <w:tr>
-              <w:tc>
-                <w:tcPr/>
-                <w:p>
-                  <w:pPr>
-                    <w:pStyle w:val="Compact"/>
-                  </w:pPr>
-                </w:p>
-              </w:tc>
-              <w:tc>
-                <w:tcPr/>
-                <w:p>
-                  <w:pPr>
-                    <w:pStyle w:val="Compact"/>
-                    <w:jc w:val="center"/>
-                  </w:pPr>
-                  <w:r>
-                    <w:t xml:space="preserve">(0.241)</w:t>
-                  </w:r>
-                </w:p>
-              </w:tc>
-              <w:tc>
-                <w:tcPr/>
-                <w:p>
-                  <w:pPr>
-                    <w:pStyle w:val="Compact"/>
-                    <w:jc w:val="center"/>
-                  </w:pPr>
-                  <w:r>
-                    <w:t xml:space="preserve">(0.251)</w:t>
-                  </w:r>
-                </w:p>
-              </w:tc>
-              <w:tc>
-                <w:tcPr/>
-                <w:p>
-                  <w:pPr>
-                    <w:pStyle w:val="Compact"/>
-                    <w:jc w:val="center"/>
-                  </w:pPr>
-                  <w:r>
-                    <w:t xml:space="preserve">(0.254)</w:t>
-                  </w:r>
-                </w:p>
-              </w:tc>
-              <w:tc>
-                <w:tcPr/>
-                <w:p>
-                  <w:pPr>
-                    <w:pStyle w:val="Compact"/>
-                    <w:jc w:val="center"/>
-                  </w:pPr>
-                  <w:r>
-                    <w:t xml:space="preserve">(0.233)</w:t>
-                  </w:r>
-                </w:p>
-              </w:tc>
-              <w:tc>
-                <w:tcPr/>
-                <w:p>
-                  <w:pPr>
-                    <w:pStyle w:val="Compact"/>
-                    <w:jc w:val="center"/>
-                  </w:pPr>
-                  <w:r>
-                    <w:t xml:space="preserve">(0.287)</w:t>
-                  </w:r>
-                </w:p>
-              </w:tc>
-            </w:tr>
-            <w:tr>
-              <w:tc>
-                <w:tcPr/>
-                <w:p>
-                  <w:pPr>
-                    <w:pStyle w:val="Compact"/>
-                    <w:jc w:val="center"/>
-                  </w:pPr>
-                  <w:r>
-                    <w:t xml:space="preserve">Intercept</w:t>
-                  </w:r>
-                </w:p>
-              </w:tc>
-              <w:tc>
-                <w:tcPr/>
-                <w:p>
-                  <w:pPr>
-                    <w:pStyle w:val="Compact"/>
-                    <w:jc w:val="center"/>
-                  </w:pPr>
-                  <w:r>
-                    <w:t xml:space="preserve">1.951***</w:t>
-                  </w:r>
-                </w:p>
-              </w:tc>
-              <w:tc>
-                <w:tcPr/>
-                <w:p>
-                  <w:pPr>
-                    <w:pStyle w:val="Compact"/>
-                    <w:jc w:val="center"/>
-                  </w:pPr>
-                  <w:r>
-                    <w:t xml:space="preserve">2.310***</w:t>
-                  </w:r>
-                </w:p>
-              </w:tc>
-              <w:tc>
-                <w:tcPr/>
-                <w:p>
-                  <w:pPr>
-                    <w:pStyle w:val="Compact"/>
-                    <w:jc w:val="center"/>
-                  </w:pPr>
-                  <w:r>
-                    <w:t xml:space="preserve">2.232***</w:t>
-                  </w:r>
-                </w:p>
-              </w:tc>
-              <w:tc>
-                <w:tcPr/>
-                <w:p>
-                  <w:pPr>
-                    <w:pStyle w:val="Compact"/>
-                    <w:jc w:val="center"/>
-                  </w:pPr>
-                  <w:r>
-                    <w:t xml:space="preserve">1.744***</w:t>
-                  </w:r>
-                </w:p>
-              </w:tc>
-              <w:tc>
-                <w:tcPr/>
-                <w:p>
-                  <w:pPr>
-                    <w:pStyle w:val="Compact"/>
-                    <w:jc w:val="center"/>
-                  </w:pPr>
-                  <w:r>
-                    <w:t xml:space="preserve">2.923***</w:t>
-                  </w:r>
-                </w:p>
-              </w:tc>
-            </w:tr>
-            <w:tr>
-              <w:tc>
-                <w:tcPr/>
-                <w:p>
-                  <w:pPr>
-                    <w:pStyle w:val="Compact"/>
-                  </w:pPr>
-                </w:p>
-              </w:tc>
-              <w:tc>
-                <w:tcPr/>
-                <w:p>
-                  <w:pPr>
-                    <w:pStyle w:val="Compact"/>
-                    <w:jc w:val="center"/>
-                  </w:pPr>
-                  <w:r>
-                    <w:t xml:space="preserve">(0.104)</w:t>
-                  </w:r>
-                </w:p>
-              </w:tc>
-              <w:tc>
-                <w:tcPr/>
-                <w:p>
-                  <w:pPr>
-                    <w:pStyle w:val="Compact"/>
-                    <w:jc w:val="center"/>
-                  </w:pPr>
-                  <w:r>
-                    <w:t xml:space="preserve">(0.110)</w:t>
-                  </w:r>
-                </w:p>
-              </w:tc>
-              <w:tc>
-                <w:tcPr/>
-                <w:p>
-                  <w:pPr>
-                    <w:pStyle w:val="Compact"/>
-                    <w:jc w:val="center"/>
-                  </w:pPr>
-                  <w:r>
-                    <w:t xml:space="preserve">(0.105)</w:t>
-                  </w:r>
-                </w:p>
-              </w:tc>
-              <w:tc>
-                <w:tcPr/>
-                <w:p>
-                  <w:pPr>
-                    <w:pStyle w:val="Compact"/>
-                    <w:jc w:val="center"/>
-                  </w:pPr>
-                  <w:r>
-                    <w:t xml:space="preserve">(0.086)</w:t>
-                  </w:r>
-                </w:p>
-              </w:tc>
-              <w:tc>
-                <w:tcPr/>
-                <w:p>
-                  <w:pPr>
-                    <w:pStyle w:val="Compact"/>
-                    <w:jc w:val="center"/>
-                  </w:pPr>
-                  <w:r>
-                    <w:t xml:space="preserve">(0.123)</w:t>
-                  </w:r>
-                </w:p>
-              </w:tc>
-            </w:tr>
-            <w:tr>
-              <w:tc>
-                <w:tcPr/>
-                <w:p>
-                  <w:pPr>
-                    <w:pStyle w:val="Compact"/>
-                    <w:jc w:val="center"/>
-                  </w:pPr>
-                  <w:r>
-                    <w:t xml:space="preserve">Climate x College</w:t>
-                  </w:r>
-                </w:p>
-              </w:tc>
-              <w:tc>
-                <w:tcPr/>
-                <w:p>
-                  <w:pPr>
-                    <w:pStyle w:val="Compact"/>
-                    <w:jc w:val="center"/>
-                  </w:pPr>
-                  <w:r>
-                    <w:t xml:space="preserve">-0.191</w:t>
-                  </w:r>
-                </w:p>
-              </w:tc>
-              <w:tc>
-                <w:tcPr/>
-                <w:p>
-                  <w:pPr>
-                    <w:pStyle w:val="Compact"/>
-                    <w:jc w:val="center"/>
-                  </w:pPr>
-                  <w:r>
-                    <w:t xml:space="preserve">-0.186</w:t>
-                  </w:r>
-                </w:p>
-              </w:tc>
-              <w:tc>
-                <w:tcPr/>
-                <w:p>
-                  <w:pPr>
-                    <w:pStyle w:val="Compact"/>
-                    <w:jc w:val="center"/>
-                  </w:pPr>
-                  <w:r>
-                    <w:t xml:space="preserve">-0.212</w:t>
-                  </w:r>
-                </w:p>
-              </w:tc>
-              <w:tc>
-                <w:tcPr/>
-                <w:p>
-                  <w:pPr>
-                    <w:pStyle w:val="Compact"/>
-                    <w:jc w:val="center"/>
-                  </w:pPr>
-                  <w:r>
-                    <w:t xml:space="preserve">-0.074</w:t>
-                  </w:r>
-                </w:p>
-              </w:tc>
-              <w:tc>
-                <w:tcPr/>
-                <w:p>
-                  <w:pPr>
-                    <w:pStyle w:val="Compact"/>
-                    <w:jc w:val="center"/>
-                  </w:pPr>
-                  <w:r>
-                    <w:t xml:space="preserve">0.072</w:t>
-                  </w:r>
-                </w:p>
-              </w:tc>
-            </w:tr>
-            <w:tr>
-              <w:tc>
-                <w:tcPr/>
-                <w:p>
-                  <w:pPr>
-                    <w:pStyle w:val="Compact"/>
-                  </w:pPr>
-                </w:p>
-              </w:tc>
-              <w:tc>
-                <w:tcPr/>
-                <w:p>
-                  <w:pPr>
-                    <w:pStyle w:val="Compact"/>
-                    <w:jc w:val="center"/>
-                  </w:pPr>
-                  <w:r>
-                    <w:t xml:space="preserve">(0.228)</w:t>
-                  </w:r>
-                </w:p>
-              </w:tc>
-              <w:tc>
-                <w:tcPr/>
-                <w:p>
-                  <w:pPr>
-                    <w:pStyle w:val="Compact"/>
-                    <w:jc w:val="center"/>
-                  </w:pPr>
-                  <w:r>
-                    <w:t xml:space="preserve">(0.224)</w:t>
-                  </w:r>
-                </w:p>
-              </w:tc>
-              <w:tc>
-                <w:tcPr/>
-                <w:p>
-                  <w:pPr>
-                    <w:pStyle w:val="Compact"/>
-                    <w:jc w:val="center"/>
-                  </w:pPr>
-                  <w:r>
-                    <w:t xml:space="preserve">(0.217)</w:t>
-                  </w:r>
-                </w:p>
-              </w:tc>
-              <w:tc>
-                <w:tcPr/>
-                <w:p>
-                  <w:pPr>
-                    <w:pStyle w:val="Compact"/>
-                    <w:jc w:val="center"/>
-                  </w:pPr>
-                  <w:r>
-                    <w:t xml:space="preserve">(0.225)</w:t>
-                  </w:r>
-                </w:p>
-              </w:tc>
-              <w:tc>
-                <w:tcPr/>
-                <w:p>
-                  <w:pPr>
-                    <w:pStyle w:val="Compact"/>
-                    <w:jc w:val="center"/>
-                  </w:pPr>
-                  <w:r>
-                    <w:t xml:space="preserve">(0.229)</w:t>
-                  </w:r>
-                </w:p>
-              </w:tc>
-            </w:tr>
-            <w:tr>
-              <w:tc>
-                <w:tcPr/>
-                <w:p>
-                  <w:pPr>
-                    <w:pStyle w:val="Compact"/>
-                    <w:jc w:val="center"/>
-                  </w:pPr>
-                  <w:r>
-                    <w:t xml:space="preserve">Climate x ConRep x College</w:t>
-                  </w:r>
-                </w:p>
-              </w:tc>
-              <w:tc>
-                <w:tcPr/>
-                <w:p>
-                  <w:pPr>
-                    <w:pStyle w:val="Compact"/>
-                    <w:jc w:val="center"/>
-                  </w:pPr>
-                  <w:r>
-                    <w:t xml:space="preserve">-0.075</w:t>
-                  </w:r>
-                </w:p>
-              </w:tc>
-              <w:tc>
-                <w:tcPr/>
-                <w:p>
-                  <w:pPr>
-                    <w:pStyle w:val="Compact"/>
-                    <w:jc w:val="center"/>
-                  </w:pPr>
-                  <w:r>
-                    <w:t xml:space="preserve">0.040</w:t>
-                  </w:r>
-                </w:p>
-              </w:tc>
-              <w:tc>
-                <w:tcPr/>
-                <w:p>
-                  <w:pPr>
-                    <w:pStyle w:val="Compact"/>
-                    <w:jc w:val="center"/>
-                  </w:pPr>
-                  <w:r>
-                    <w:t xml:space="preserve">-0.058</w:t>
-                  </w:r>
-                </w:p>
-              </w:tc>
-              <w:tc>
-                <w:tcPr/>
-                <w:p>
-                  <w:pPr>
-                    <w:pStyle w:val="Compact"/>
-                    <w:jc w:val="center"/>
-                  </w:pPr>
-                  <w:r>
-                    <w:t xml:space="preserve">-0.123</w:t>
-                  </w:r>
-                </w:p>
-              </w:tc>
-              <w:tc>
-                <w:tcPr/>
-                <w:p>
-                  <w:pPr>
-                    <w:pStyle w:val="Compact"/>
-                    <w:jc w:val="center"/>
-                  </w:pPr>
-                  <w:r>
-                    <w:t xml:space="preserve">-0.418</w:t>
-                  </w:r>
-                </w:p>
-              </w:tc>
-            </w:tr>
-            <w:tr>
-              <w:tc>
-                <w:tcPr/>
-                <w:p>
-                  <w:pPr>
-                    <w:pStyle w:val="Compact"/>
-                  </w:pPr>
-                </w:p>
-              </w:tc>
-              <w:tc>
-                <w:tcPr/>
-                <w:p>
-                  <w:pPr>
-                    <w:pStyle w:val="Compact"/>
-                    <w:jc w:val="center"/>
-                  </w:pPr>
-                  <w:r>
-                    <w:t xml:space="preserve">(0.324)</w:t>
-                  </w:r>
-                </w:p>
-              </w:tc>
-              <w:tc>
-                <w:tcPr/>
-                <w:p>
-                  <w:pPr>
-                    <w:pStyle w:val="Compact"/>
-                    <w:jc w:val="center"/>
-                  </w:pPr>
-                  <w:r>
-                    <w:t xml:space="preserve">(0.298)</w:t>
-                  </w:r>
-                </w:p>
-              </w:tc>
-              <w:tc>
-                <w:tcPr/>
-                <w:p>
-                  <w:pPr>
-                    <w:pStyle w:val="Compact"/>
-                    <w:jc w:val="center"/>
-                  </w:pPr>
-                  <w:r>
-                    <w:t xml:space="preserve">(0.303)</w:t>
-                  </w:r>
-                </w:p>
-              </w:tc>
-              <w:tc>
-                <w:tcPr/>
-                <w:p>
-                  <w:pPr>
-                    <w:pStyle w:val="Compact"/>
-                    <w:jc w:val="center"/>
-                  </w:pPr>
-                  <w:r>
-                    <w:t xml:space="preserve">(0.334)</w:t>
-                  </w:r>
-                </w:p>
-              </w:tc>
-              <w:tc>
-                <w:tcPr/>
-                <w:p>
-                  <w:pPr>
-                    <w:pStyle w:val="Compact"/>
-                    <w:jc w:val="center"/>
-                  </w:pPr>
-                  <w:r>
-                    <w:t xml:space="preserve">(0.330)</w:t>
-                  </w:r>
-                </w:p>
-              </w:tc>
-            </w:tr>
-            <w:tr>
-              <w:tc>
-                <w:tcPr/>
-                <w:p>
-                  <w:pPr>
-                    <w:pStyle w:val="Compact"/>
-                    <w:jc w:val="center"/>
-                  </w:pPr>
-                  <w:r>
-                    <w:t xml:space="preserve">Climate x LibDem x College</w:t>
-                  </w:r>
-                </w:p>
-              </w:tc>
-              <w:tc>
-                <w:tcPr/>
-                <w:p>
-                  <w:pPr>
-                    <w:pStyle w:val="Compact"/>
-                    <w:jc w:val="center"/>
-                  </w:pPr>
-                  <w:r>
-                    <w:t xml:space="preserve">-0.010</w:t>
-                  </w:r>
-                </w:p>
-              </w:tc>
-              <w:tc>
-                <w:tcPr/>
-                <w:p>
-                  <w:pPr>
-                    <w:pStyle w:val="Compact"/>
-                    <w:jc w:val="center"/>
-                  </w:pPr>
-                  <w:r>
-                    <w:t xml:space="preserve">0.144</w:t>
-                  </w:r>
-                </w:p>
-              </w:tc>
-              <w:tc>
-                <w:tcPr/>
-                <w:p>
-                  <w:pPr>
-                    <w:pStyle w:val="Compact"/>
-                    <w:jc w:val="center"/>
-                  </w:pPr>
-                  <w:r>
-                    <w:t xml:space="preserve">0.140</w:t>
-                  </w:r>
-                </w:p>
-              </w:tc>
-              <w:tc>
-                <w:tcPr/>
-                <w:p>
-                  <w:pPr>
-                    <w:pStyle w:val="Compact"/>
-                    <w:jc w:val="center"/>
-                  </w:pPr>
-                  <w:r>
-                    <w:t xml:space="preserve">0.004</w:t>
-                  </w:r>
-                </w:p>
-              </w:tc>
-              <w:tc>
-                <w:tcPr/>
-                <w:p>
-                  <w:pPr>
-                    <w:pStyle w:val="Compact"/>
-                    <w:jc w:val="center"/>
-                  </w:pPr>
-                  <w:r>
-                    <w:t xml:space="preserve">-0.241</w:t>
-                  </w:r>
-                </w:p>
-              </w:tc>
-            </w:tr>
-            <w:tr>
-              <w:tc>
-                <w:tcPr/>
-                <w:p>
-                  <w:pPr>
-                    <w:pStyle w:val="Compact"/>
-                  </w:pPr>
-                </w:p>
-              </w:tc>
-              <w:tc>
-                <w:tcPr/>
-                <w:p>
-                  <w:pPr>
-                    <w:pStyle w:val="Compact"/>
-                    <w:jc w:val="center"/>
-                  </w:pPr>
-                  <w:r>
-                    <w:t xml:space="preserve">(0.261)</w:t>
-                  </w:r>
-                </w:p>
-              </w:tc>
-              <w:tc>
-                <w:tcPr/>
-                <w:p>
-                  <w:pPr>
-                    <w:pStyle w:val="Compact"/>
-                    <w:jc w:val="center"/>
-                  </w:pPr>
-                  <w:r>
-                    <w:t xml:space="preserve">(0.263)</w:t>
-                  </w:r>
-                </w:p>
-              </w:tc>
-              <w:tc>
-                <w:tcPr/>
-                <w:p>
-                  <w:pPr>
-                    <w:pStyle w:val="Compact"/>
-                    <w:jc w:val="center"/>
-                  </w:pPr>
-                  <w:r>
-                    <w:t xml:space="preserve">(0.253)</w:t>
-                  </w:r>
-                </w:p>
-              </w:tc>
-              <w:tc>
-                <w:tcPr/>
-                <w:p>
-                  <w:pPr>
-                    <w:pStyle w:val="Compact"/>
-                    <w:jc w:val="center"/>
-                  </w:pPr>
-                  <w:r>
-                    <w:t xml:space="preserve">(0.248)</w:t>
-                  </w:r>
-                </w:p>
-              </w:tc>
-              <w:tc>
-                <w:tcPr/>
-                <w:p>
-                  <w:pPr>
-                    <w:pStyle w:val="Compact"/>
-                    <w:jc w:val="center"/>
-                  </w:pPr>
-                  <w:r>
-                    <w:t xml:space="preserve">(0.286)</w:t>
-                  </w:r>
-                </w:p>
-              </w:tc>
-            </w:tr>
-            <w:tr>
-              <w:tc>
-                <w:tcPr/>
-                <w:p>
-                  <w:pPr>
-                    <w:pStyle w:val="Compact"/>
-                    <w:jc w:val="center"/>
-                  </w:pPr>
-                  <w:r>
-                    <w:t xml:space="preserve">Num.Obs.</w:t>
-                  </w:r>
-                </w:p>
-              </w:tc>
-              <w:tc>
-                <w:tcPr/>
-                <w:p>
-                  <w:pPr>
-                    <w:pStyle w:val="Compact"/>
-                    <w:jc w:val="center"/>
-                  </w:pPr>
-                  <w:r>
-                    <w:t xml:space="preserve">3113</w:t>
-                  </w:r>
-                </w:p>
-              </w:tc>
-              <w:tc>
-                <w:tcPr/>
-                <w:p>
-                  <w:pPr>
-                    <w:pStyle w:val="Compact"/>
-                    <w:jc w:val="center"/>
-                  </w:pPr>
-                  <w:r>
-                    <w:t xml:space="preserve">3113</w:t>
-                  </w:r>
-                </w:p>
-              </w:tc>
-              <w:tc>
-                <w:tcPr/>
-                <w:p>
-                  <w:pPr>
-                    <w:pStyle w:val="Compact"/>
-                    <w:jc w:val="center"/>
-                  </w:pPr>
-                  <w:r>
-                    <w:t xml:space="preserve">3113</w:t>
-                  </w:r>
-                </w:p>
-              </w:tc>
-              <w:tc>
-                <w:tcPr/>
-                <w:p>
-                  <w:pPr>
-                    <w:pStyle w:val="Compact"/>
-                    <w:jc w:val="center"/>
-                  </w:pPr>
-                  <w:r>
-                    <w:t xml:space="preserve">3113</w:t>
-                  </w:r>
-                </w:p>
-              </w:tc>
-              <w:tc>
-                <w:tcPr/>
-                <w:p>
-                  <w:pPr>
-                    <w:pStyle w:val="Compact"/>
-                    <w:jc w:val="center"/>
-                  </w:pPr>
-                  <w:r>
-                    <w:t xml:space="preserve">3113</w:t>
-                  </w:r>
-                </w:p>
-              </w:tc>
-            </w:tr>
-            <w:tr>
-              <w:tc>
-                <w:tcPr/>
-                <w:p>
-                  <w:pPr>
-                    <w:pStyle w:val="Compact"/>
-                    <w:jc w:val="center"/>
-                  </w:pPr>
-                  <w:r>
-                    <w:t xml:space="preserve">R2</w:t>
-                  </w:r>
-                </w:p>
-              </w:tc>
-              <w:tc>
-                <w:tcPr/>
-                <w:p>
-                  <w:pPr>
-                    <w:pStyle w:val="Compact"/>
-                    <w:jc w:val="center"/>
-                  </w:pPr>
-                  <w:r>
-                    <w:t xml:space="preserve">0.331</w:t>
-                  </w:r>
-                </w:p>
-              </w:tc>
-              <w:tc>
-                <w:tcPr/>
-                <w:p>
-                  <w:pPr>
-                    <w:pStyle w:val="Compact"/>
-                    <w:jc w:val="center"/>
-                  </w:pPr>
-                  <w:r>
-                    <w:t xml:space="preserve">0.368</w:t>
-                  </w:r>
-                </w:p>
-              </w:tc>
-              <w:tc>
-                <w:tcPr/>
-                <w:p>
-                  <w:pPr>
-                    <w:pStyle w:val="Compact"/>
-                    <w:jc w:val="center"/>
-                  </w:pPr>
-                  <w:r>
-                    <w:t xml:space="preserve">0.359</w:t>
-                  </w:r>
-                </w:p>
-              </w:tc>
-              <w:tc>
-                <w:tcPr/>
-                <w:p>
-                  <w:pPr>
-                    <w:pStyle w:val="Compact"/>
-                    <w:jc w:val="center"/>
-                  </w:pPr>
-                  <w:r>
-                    <w:t xml:space="preserve">0.314</w:t>
-                  </w:r>
-                </w:p>
-              </w:tc>
-              <w:tc>
-                <w:tcPr/>
-                <w:p>
-                  <w:pPr>
-                    <w:pStyle w:val="Compact"/>
-                    <w:jc w:val="center"/>
-                  </w:pPr>
-                  <w:r>
-                    <w:t xml:space="preserve">0.165</w:t>
-                  </w:r>
-                </w:p>
-              </w:tc>
-            </w:tr>
-            <w:tr>
-              <w:tc>
-                <w:tcPr>
-                  <w:gridSpan w:val="6"/>
-                </w:tcPr>
-                <w:p>
-                  <w:pPr>
-                    <w:pStyle w:val="Compact"/>
-                    <w:jc w:val="center"/>
-                  </w:pPr>
-                  <w:r>
-                    <w:t xml:space="preserve">† p &lt; 0.1, * p &lt; 0.05, ** p &lt; 0.01, *** p &lt; 0.001</w:t>
-                  </w:r>
-                </w:p>
-              </w:tc>
-            </w:tr>
-            <w:tr>
-              <w:tc>
-                <w:tcPr>
-                  <w:gridSpan w:val="6"/>
-                </w:tcPr>
-                <w:p>
-                  <w:pPr>
-                    <w:pStyle w:val="Compact"/>
-                    <w:jc w:val="center"/>
-                  </w:pPr>
-                  <w:r>
-                    <w:t xml:space="preserve">Survey-weighted OLS (svyglm). Exploratory model adding climate.cue:college and its</w:t>
-                  </w:r>
-                  <w:r>
-                    <w:t xml:space="preserve"> </w:t>
-                  </w:r>
-                  <w:r>
-                    <w:t xml:space="preserve">interactions with conRep/libDem to the preregistered H1-H4 specification; not used for the</w:t>
-                  </w:r>
-                  <w:r>
-                    <w:t xml:space="preserve"> </w:t>
-                  </w:r>
-                  <w:r>
-                    <w:t xml:space="preserve">preregistered hypothesis tests.</w:t>
-                  </w:r>
-                </w:p>
-              </w:tc>
-            </w:tr>
-          </w:tbl>
-          <w:bookmarkEnd w:id="30"/>
-          <w:p/>
-        </w:tc>
-      </w:tr>
-    </w:tbl>
     <w:p>
       <w:r>
         <w:br w:type="page"/>
@@ -12503,7 +9613,7 @@
       </w:r>
     </w:p>
   </w:footnote>
-  <w:footnote w:id="27">
+  <w:footnote w:id="18">
     <w:p>
       <w:pPr>
         <w:pStyle w:val="FootnoteText"/>
@@ -12518,21 +9628,87 @@
         <w:t xml:space="preserve"> </w:t>
       </w:r>
       <w:r>
-        <w:t xml:space="preserve">I also examined the interaction of education and the climate cue. Like the Trump cue, there were no significant differences. The results are shown in the Appendix,</w:t>
-      </w:r>
-      <w:r>
-        <w:t xml:space="preserve"> </w:t>
-      </w:r>
-      <w:hyperlink w:anchor="tbl-results-explore">
-        <w:r>
-          <w:rPr>
-            <w:rStyle w:val="Hyperlink"/>
-          </w:rPr>
-          <w:t xml:space="preserve">Table 4</w:t>
-        </w:r>
-      </w:hyperlink>
-      <w:r>
-        <w:t xml:space="preserve">.</w:t>
+        <w:t xml:space="preserve">I checked variance inflation factors (VIFs) for the full model given its higher-order interaction terms. Several interaction terms show elevated VIFs (5-20), but this reflects the expected structural correlation between a three-way interaction and its component lower-order terms rather than a substantive collinearity problem, and all three-way interaction cells contain more than 100 respondents.</w:t>
+      </w:r>
+    </w:p>
+  </w:footnote>
+  <w:footnote w:id="28">
+    <w:p>
+      <w:pPr>
+        <w:pStyle w:val="FootnoteText"/>
+      </w:pPr>
+      <w:r>
+        <w:rPr>
+          <w:rStyle w:val="FootnoteReference"/>
+        </w:rPr>
+        <w:footnoteRef/>
+      </w:r>
+      <w:r>
+        <w:t xml:space="preserve"> </w:t>
+      </w:r>
+      <w:r>
+        <w:t xml:space="preserve">I also examined the interaction of education and the climate cue. Like the Trump cue, there were no significant differences. The results are shown in the Supplemental Materials.</w:t>
+      </w:r>
+    </w:p>
+  </w:footnote>
+  <w:footnote w:id="30">
+    <w:p>
+      <w:pPr>
+        <w:pStyle w:val="FootnoteText"/>
+      </w:pPr>
+      <w:r>
+        <w:rPr>
+          <w:rStyle w:val="FootnoteReference"/>
+        </w:rPr>
+        <w:footnoteRef/>
+      </w:r>
+      <w:r>
+        <w:t xml:space="preserve"> </w:t>
+      </w:r>
+      <w:r>
+        <w:t xml:space="preserve">The Trump cue x conservative Republican interaction for cancelling offshore wind projects is marginally significant (</w:t>
+      </w:r>
+      <w:r>
+        <w:rPr>
+          <w:i/>
+          <w:iCs/>
+        </w:rPr>
+        <w:t xml:space="preserve">p</w:t>
+      </w:r>
+      <w:r>
+        <w:t xml:space="preserve"> </w:t>
+      </w:r>
+      <w:r>
+        <w:t xml:space="preserve">= .095) in the main specification but falls just short of the</w:t>
+      </w:r>
+      <w:r>
+        <w:t xml:space="preserve"> </w:t>
+      </w:r>
+      <w:r>
+        <w:rPr>
+          <w:i/>
+          <w:iCs/>
+        </w:rPr>
+        <w:t xml:space="preserve">p</w:t>
+      </w:r>
+      <w:r>
+        <w:t xml:space="preserve"> </w:t>
+      </w:r>
+      <w:r>
+        <w:t xml:space="preserve">&lt; .10 threshold (</w:t>
+      </w:r>
+      <w:r>
+        <w:rPr>
+          <w:i/>
+          <w:iCs/>
+        </w:rPr>
+        <w:t xml:space="preserve">p</w:t>
+      </w:r>
+      <w:r>
+        <w:t xml:space="preserve"> </w:t>
+      </w:r>
+      <w:r>
+        <w:t xml:space="preserve">= .117) when age, sex, race, and income are added as controls. See the Supplemental Materials for this and other robustness checks.</w:t>
       </w:r>
     </w:p>
   </w:footnote>

</xml_diff>